<commit_message>
p5: fix CWE-209 + ParseInt errors; replace CWE-614 in CVSS table
- Fix CWE-209: replace Go error details in HTTP responses with generic 'Internal server error'
  in render(), renderPartial() in web/handler.go
- Fix remaining ParseInt ignored errors in FlagForm, FlagPayment, RejectForm, RejectPayment
- Regenerate securep5.docx: replace CWE-614 (covered in p4) with CWE-209 as 5th CVSS entry
- All 5 CVSS vulnerabilities are now unique vs p4: CWE-400, CWE-613, CWE-117, CWE-20, CWE-209
- More human-friendly narrative formatting throughout the report
</commit_message>
<xml_diff>
--- a/securep5.docx
+++ b/securep5.docx
@@ -21,42 +21,51 @@
       <w:r>
         <w:rPr>
           <w:b/>
+          <w:sz w:val="24"/>
         </w:rPr>
-        <w:t>Тема: Комплексный анализ безопасности MVP: обработка памяти и ресурсов,</w:t>
-        <w:br/>
-        <w:t>инъекционные уязвимости, аутентификация, авторизация и криптографическая защита</w:t>
+        <w:t>Тема: Комплексный анализ безопасности MVP — обработка памяти и ресурсов, инъекционные уязвимости, аутентификация, авторизация и криптографическая защита</w:t>
       </w:r>
     </w:p>
     <w:p/>
     <w:p>
       <w:pPr>
+        <w:spacing w:after="80"/>
         <w:ind w:left="0"/>
       </w:pPr>
       <w:r>
+        <w:rPr>
+          <w:b w:val="0"/>
+        </w:rPr>
         <w:t>Вариант 10: Финтех — цифровые платежи и мониторинг мошенничества</w:t>
       </w:r>
     </w:p>
     <w:p>
       <w:pPr>
+        <w:spacing w:after="80"/>
         <w:ind w:left="0"/>
       </w:pPr>
       <w:r>
+        <w:rPr>
+          <w:b w:val="0"/>
+        </w:rPr>
         <w:t>Выполнил: Студент магистратуры, группа ИБ-1</w:t>
       </w:r>
     </w:p>
     <w:p>
       <w:pPr>
+        <w:spacing w:after="80"/>
         <w:ind w:left="0"/>
       </w:pPr>
       <w:r>
+        <w:rPr>
+          <w:b w:val="0"/>
+        </w:rPr>
         <w:t>Проверил: Преподаватель кафедры информационной безопасности</w:t>
       </w:r>
     </w:p>
-    <w:p/>
     <w:p>
       <w:pPr>
-        <w:spacing w:before="240" w:after="80"/>
-        <w:jc w:val="left"/>
+        <w:spacing w:before="280" w:after="80"/>
       </w:pPr>
       <w:r>
         <w:rPr>
@@ -69,10 +78,14 @@
     </w:p>
     <w:p>
       <w:pPr>
+        <w:spacing w:after="80"/>
         <w:ind w:left="0"/>
       </w:pPr>
       <w:r>
-        <w:t>Провести углублённый комплексный аудит безопасности MVP-системы fintech-payments-mvp (Go, Gin, SQLite) по четырём направлениям: управление памятью и ресурсами, инъекционные уязвимости и обработка входных данных, аутентификация/авторизация/криптография, а также количественная оценка рисков по CVSS v4.0. Для каждой выявленной проблемы реализовать исправление, подтвердить устранение дефекта и классифицировать по CWE.</w:t>
+        <w:rPr>
+          <w:b w:val="0"/>
+        </w:rPr>
+        <w:t>Цель данной работы — провести углублённый аудит безопасности уже реализованного MVP-проекта fintech-payments-mvp (Go, Gin, SQLite) по четырём направлениям: управление памятью и ресурсами; безопасность входных данных и потенциальные injection-векторы; аутентификация, авторизация и криптография; количественная оценка рисков по методологии CVSS v4.0. Для каждой выявленной проблемы необходимо реализовать исправление в коде, продемонстрировать его корректность и классифицировать уязвимость по CWE.</w:t>
       </w:r>
     </w:p>
     <w:p>
@@ -82,8 +95,7 @@
     </w:p>
     <w:p>
       <w:pPr>
-        <w:spacing w:before="240" w:after="80"/>
-        <w:jc w:val="left"/>
+        <w:spacing w:before="280" w:after="80"/>
       </w:pPr>
       <w:r>
         <w:rPr>
@@ -96,7 +108,19 @@
     </w:p>
     <w:p>
       <w:pPr>
-        <w:spacing w:before="160" w:after="40"/>
+        <w:spacing w:after="80"/>
+        <w:ind w:left="0"/>
+      </w:pPr>
+      <w:r>
+        <w:rPr>
+          <w:b w:val="0"/>
+        </w:rPr>
+        <w:t>Аудит охватывал все точки, где приложение потребляет память или удерживает системные ресурсы: HTTP-буферы, курсоры базы данных, объекты в памяти. Ниже приведены выявленные риски, критический сценарий и сводное сравнение поведения до и после защиты.</w:t>
+      </w:r>
+    </w:p>
+    <w:p>
+      <w:pPr>
+        <w:spacing w:before="200" w:after="60"/>
       </w:pPr>
       <w:r>
         <w:rPr>
@@ -104,7 +128,7 @@
           <w:color w:val="2E74B5"/>
           <w:sz w:val="24"/>
         </w:rPr>
-        <w:t>2.1. Таблица рисков — управление памятью и ресурсами</w:t>
+        <w:t>2.1. Таблица рисков</w:t>
       </w:r>
     </w:p>
     <w:tbl>
@@ -124,7 +148,7 @@
         <w:tc>
           <w:tcPr>
             <w:tcW w:type="dxa" w:w="1938"/>
-            <w:shd w:val="clear" w:color="auto" w:fill="BDD7EE"/>
+            <w:shd w:val="clear" w:color="auto" w:fill="C9DAF8"/>
           </w:tcPr>
           <w:p>
             <w:pPr>
@@ -134,14 +158,14 @@
               <w:rPr>
                 <w:b/>
               </w:rPr>
-              <w:t>#</w:t>
+              <w:t>№</w:t>
             </w:r>
           </w:p>
         </w:tc>
         <w:tc>
           <w:tcPr>
             <w:tcW w:type="dxa" w:w="1938"/>
-            <w:shd w:val="clear" w:color="auto" w:fill="BDD7EE"/>
+            <w:shd w:val="clear" w:color="auto" w:fill="C9DAF8"/>
           </w:tcPr>
           <w:p>
             <w:pPr>
@@ -151,14 +175,14 @@
               <w:rPr>
                 <w:b/>
               </w:rPr>
-              <w:t>Область</w:t>
+              <w:t>Область / файл</w:t>
             </w:r>
           </w:p>
         </w:tc>
         <w:tc>
           <w:tcPr>
             <w:tcW w:type="dxa" w:w="1938"/>
-            <w:shd w:val="clear" w:color="auto" w:fill="BDD7EE"/>
+            <w:shd w:val="clear" w:color="auto" w:fill="C9DAF8"/>
           </w:tcPr>
           <w:p>
             <w:pPr>
@@ -175,7 +199,7 @@
         <w:tc>
           <w:tcPr>
             <w:tcW w:type="dxa" w:w="1938"/>
-            <w:shd w:val="clear" w:color="auto" w:fill="BDD7EE"/>
+            <w:shd w:val="clear" w:color="auto" w:fill="C9DAF8"/>
           </w:tcPr>
           <w:p>
             <w:pPr>
@@ -192,7 +216,7 @@
         <w:tc>
           <w:tcPr>
             <w:tcW w:type="dxa" w:w="1938"/>
-            <w:shd w:val="clear" w:color="auto" w:fill="BDD7EE"/>
+            <w:shd w:val="clear" w:color="auto" w:fill="C9DAF8"/>
           </w:tcPr>
           <w:p>
             <w:pPr>
@@ -245,9 +269,9 @@
               <w:jc w:val="left"/>
             </w:pPr>
             <w:r>
-              <w:t>CWE-400: нет ограничения — атакующий отправляет тело</w:t>
+              <w:t>CWE-400</w:t>
               <w:br/>
-              <w:t>&gt;100 МБ, сервер потребляет всю RAM</w:t>
+              <w:t>ДоС через RAM: атакующий отправляет тело &gt; 100 МБ, сервер читает его целиком</w:t>
             </w:r>
           </w:p>
         </w:tc>
@@ -260,9 +284,7 @@
               <w:jc w:val="left"/>
             </w:pPr>
             <w:r>
-              <w:t>Ограничение отсутствует;</w:t>
-              <w:br/>
-              <w:t>Gin читает тело полностью в буфер</w:t>
+              <w:t>Никакого ограничения нет, Gin буферизует тело полностью</w:t>
             </w:r>
           </w:p>
         </w:tc>
@@ -275,9 +297,7 @@
               <w:jc w:val="left"/>
             </w:pPr>
             <w:r>
-              <w:t>MaxBodySizeMiddleware(1 МБ) через http.MaxBytesReader;</w:t>
-              <w:br/>
-              <w:t>POST &gt; 1 МБ → 413</w:t>
+              <w:t>MaxBodySizeMiddleware(1 МБ) через http.MaxBytesReader; тело &gt; 1 МБ → 413</w:t>
             </w:r>
           </w:p>
         </w:tc>
@@ -320,9 +340,9 @@
               <w:jc w:val="left"/>
             </w:pPr>
             <w:r>
-              <w:t>CWE-703: rows.Err() не проверяется;</w:t>
+              <w:t>CWE-703</w:t>
               <w:br/>
-              <w:t>ошибка итерации молча игнорируется</w:t>
+              <w:t>rows.Err() не проверяется; ошибка разрыва соединения во время итерации молча игнорируется</w:t>
             </w:r>
           </w:p>
         </w:tc>
@@ -335,9 +355,7 @@
               <w:jc w:val="left"/>
             </w:pPr>
             <w:r>
-              <w:t>return payments, nil даже при</w:t>
-              <w:br/>
-              <w:t>ошибке разрыва соединения</w:t>
+              <w:t>return payments, nil — частичный результат без признака ошибки</w:t>
             </w:r>
           </w:p>
         </w:tc>
@@ -350,9 +368,7 @@
               <w:jc w:val="left"/>
             </w:pPr>
             <w:r>
-              <w:t>rows.Err() проверяется после цикла;</w:t>
-              <w:br/>
-              <w:t>ошибка возвращается вызывающему</w:t>
+              <w:t>rows.Err() проверяется после цикла; ошибка явно возвращается вызывающему</w:t>
             </w:r>
           </w:p>
         </w:tc>
@@ -395,9 +411,9 @@
               <w:jc w:val="left"/>
             </w:pPr>
             <w:r>
-              <w:t>CWE-703: аналогичная проблема с rows.Err()</w:t>
+              <w:t>CWE-703</w:t>
               <w:br/>
-              <w:t>в аудит-репозитории</w:t>
+              <w:t>Аналогичная проблема в аудит-репозитории</w:t>
             </w:r>
           </w:p>
         </w:tc>
@@ -410,9 +426,7 @@
               <w:jc w:val="left"/>
             </w:pPr>
             <w:r>
-              <w:t>return logs, nil без проверки</w:t>
-              <w:br/>
-              <w:t>ошибки итерации</w:t>
+              <w:t>return logs, nil без проверки rows.Err()</w:t>
             </w:r>
           </w:p>
         </w:tc>
@@ -425,7 +439,7 @@
               <w:jc w:val="left"/>
             </w:pPr>
             <w:r>
-              <w:t>rows.Err() проверяется после цикла</w:t>
+              <w:t>rows.Err() проверяется после завершения цикла</w:t>
             </w:r>
           </w:p>
         </w:tc>
@@ -453,7 +467,7 @@
               <w:jc w:val="left"/>
             </w:pPr>
             <w:r>
-              <w:t>Загрузка N записей в AnalystPage</w:t>
+              <w:t>Загрузка записей — AnalystPage</w:t>
               <w:br/>
               <w:t>internal/web/handler.go</w:t>
             </w:r>
@@ -468,9 +482,9 @@
               <w:jc w:val="left"/>
             </w:pPr>
             <w:r>
-              <w:t>CWE-400: GetFlaggedPayments(100,0) —</w:t>
+              <w:t>CWE-400</w:t>
               <w:br/>
-              <w:t>неконтролируемая загрузка на каждый GET /analyst</w:t>
+              <w:t>GetFlaggedPayments(100, 0) на каждый GET /analyst: неконтролируемая нагрузка</w:t>
             </w:r>
           </w:p>
         </w:tc>
@@ -483,9 +497,7 @@
               <w:jc w:val="left"/>
             </w:pPr>
             <w:r>
-              <w:t>Жёстко заданный предел 100 записей</w:t>
-              <w:br/>
-              <w:t>на каждый запрос страницы</w:t>
+              <w:t>Жёстко заданные 100 записей при каждом запросе страницы</w:t>
             </w:r>
           </w:p>
         </w:tc>
@@ -498,18 +510,15 @@
               <w:jc w:val="left"/>
             </w:pPr>
             <w:r>
-              <w:t>Предел снижен до 50;</w:t>
-              <w:br/>
-              <w:t>для пагинации используется offset</w:t>
+              <w:t>Предел снижен до 50; для полного списка используется пагинация</w:t>
             </w:r>
           </w:p>
         </w:tc>
       </w:tr>
     </w:tbl>
-    <w:p/>
     <w:p>
       <w:pPr>
-        <w:spacing w:before="160" w:after="40"/>
+        <w:spacing w:before="200" w:after="60"/>
       </w:pPr>
       <w:r>
         <w:rPr>
@@ -517,32 +526,37 @@
           <w:color w:val="2E74B5"/>
           <w:sz w:val="24"/>
         </w:rPr>
-        <w:t>2.2. Критический сценарий: переполнение памяти через тело запроса</w:t>
+        <w:t>2.2. Критический сценарий: DoS через тело запроса</w:t>
       </w:r>
     </w:p>
     <w:p>
       <w:pPr>
+        <w:spacing w:after="80"/>
         <w:ind w:left="0"/>
       </w:pPr>
       <w:r>
-        <w:t>Endpoint POST /api/v1/auth/register принимает JSON без ограничения размера. Атакующий отправляет тело объёмом 500 МБ → Gin читает его целиком в RAM → исчерпание памяти процесса → аварийное завершение (DoS).</w:t>
+        <w:rPr>
+          <w:b w:val="0"/>
+        </w:rPr>
+        <w:t>Рассмотрим endpoint POST /api/v1/auth/register. До исправления он принимал JSON-тело любого размера без каких-либо ограничений. Атакующий без авторизации мог отправить тело объёмом 500 МБ — Gin читал его целиком в оперативную память, что приводило к исчерпанию RAM и аварийному завершению процесса (OOM crash).</w:t>
       </w:r>
     </w:p>
     <w:p>
       <w:pPr>
-        <w:spacing w:before="120" w:after="40"/>
+        <w:spacing w:after="20"/>
       </w:pPr>
       <w:r>
         <w:rPr>
           <w:b/>
-          <w:sz w:val="22"/>
+          <w:color w:val="707070"/>
+          <w:sz w:val="20"/>
         </w:rPr>
-        <w:t>Код до исправления (cmd/server/main.go)</w:t>
+        <w:t>Код ДО — cmd/server/main.go:</w:t>
       </w:r>
     </w:p>
     <w:p>
       <w:pPr>
-        <w:shd w:val="clear" w:color="auto" w:fill="F2F2F2"/>
+        <w:shd w:val="clear" w:color="auto" w:fill="F0F0F0"/>
         <w:spacing w:before="40" w:after="40"/>
         <w:ind w:left="283"/>
       </w:pPr>
@@ -555,24 +569,27 @@
         <w:br/>
         <w:t>r.Use(middleware.SecurityHeaders())</w:t>
         <w:br/>
-        <w:t>r.Use(middleware.RateLimitMiddleware(cfg))  // без ограничения размера тела</w:t>
+        <w:t>r.Use(middleware.RateLimitMiddleware(cfg))</w:t>
+        <w:br/>
+        <w:t>// ← ограничение размера тела отсутствует</w:t>
       </w:r>
     </w:p>
     <w:p>
       <w:pPr>
-        <w:spacing w:before="120" w:after="40"/>
+        <w:spacing w:after="20"/>
       </w:pPr>
       <w:r>
         <w:rPr>
           <w:b/>
-          <w:sz w:val="22"/>
+          <w:color w:val="707070"/>
+          <w:sz w:val="20"/>
         </w:rPr>
-        <w:t>Код после исправления</w:t>
+        <w:t>Код ПОСЛЕ:</w:t>
       </w:r>
     </w:p>
     <w:p>
       <w:pPr>
-        <w:shd w:val="clear" w:color="auto" w:fill="F2F2F2"/>
+        <w:shd w:val="clear" w:color="auto" w:fill="F0F0F0"/>
         <w:spacing w:before="40" w:after="40"/>
         <w:ind w:left="283"/>
       </w:pPr>
@@ -585,16 +602,27 @@
         <w:br/>
         <w:t>r.Use(middleware.SecurityHeaders())</w:t>
         <w:br/>
-        <w:t>// FIX: CWE-400 — ограничение тела запроса 1 МБ</w:t>
-        <w:br/>
-        <w:t>r.Use(middleware.MaxBodySizeMiddleware(1 &lt;&lt; 20))</w:t>
+        <w:t>r.Use(middleware.MaxBodySizeMiddleware(1 &lt;&lt; 20)) // 1 MB — CWE-400 fix</w:t>
         <w:br/>
         <w:t>r.Use(middleware.RateLimitMiddleware(cfg))</w:t>
       </w:r>
     </w:p>
     <w:p>
       <w:pPr>
-        <w:shd w:val="clear" w:color="auto" w:fill="F2F2F2"/>
+        <w:spacing w:after="20"/>
+      </w:pPr>
+      <w:r>
+        <w:rPr>
+          <w:b/>
+          <w:color w:val="707070"/>
+          <w:sz w:val="20"/>
+        </w:rPr>
+        <w:t>Реализация middleware (internal/middleware/security.go):</w:t>
+      </w:r>
+    </w:p>
+    <w:p>
+      <w:pPr>
+        <w:shd w:val="clear" w:color="auto" w:fill="F0F0F0"/>
         <w:spacing w:before="40" w:after="40"/>
         <w:ind w:left="283"/>
       </w:pPr>
@@ -603,7 +631,9 @@
           <w:rFonts w:ascii="Courier New" w:hAnsi="Courier New"/>
           <w:sz w:val="18"/>
         </w:rPr>
-        <w:t>// internal/middleware/security.go</w:t>
+        <w:t>// MaxBodySizeMiddleware ограничивает тело запроса maxBytes байтами.</w:t>
+        <w:br/>
+        <w:t>// При превышении — 413 Request Entity Too Large, тело не читается.</w:t>
         <w:br/>
         <w:t>func MaxBodySizeMiddleware(maxBytes int64) gin.HandlerFunc {</w:t>
         <w:br/>
@@ -611,7 +641,9 @@
         <w:br/>
         <w:t xml:space="preserve">        if c.Request.Body != nil {</w:t>
         <w:br/>
-        <w:t xml:space="preserve">            c.Request.Body = http.MaxBytesReader(c.Writer, c.Request.Body, maxBytes)</w:t>
+        <w:t xml:space="preserve">            c.Request.Body = http.MaxBytesReader(</w:t>
+        <w:br/>
+        <w:t xml:space="preserve">                c.Writer, c.Request.Body, maxBytes)</w:t>
         <w:br/>
         <w:t xml:space="preserve">        }</w:t>
         <w:br/>
@@ -624,19 +656,44 @@
     </w:p>
     <w:p>
       <w:pPr>
-        <w:spacing w:before="120" w:after="40"/>
+        <w:spacing w:after="80"/>
+        <w:ind w:left="0"/>
+      </w:pPr>
+      <w:r>
+        <w:rPr>
+          <w:b w:val="0"/>
+        </w:rPr>
+        <w:t>Объяснение: http.MaxBytesReader оборачивает тело и останавливает чтение, как только достигнут лимит. Gin получает ошибку при попытке распарсить JSON и возвращает клиенту 413, не загружая ни байта сверх лимита в RAM.</w:t>
+      </w:r>
+    </w:p>
+    <w:p>
+      <w:pPr>
+        <w:spacing w:after="80"/>
+        <w:ind w:left="0"/>
+      </w:pPr>
+      <w:r>
+        <w:rPr>
+          <w:b w:val="0"/>
+        </w:rPr>
+        <w:t>Подтверждение: curl с 2 МБ телом → 413; gosec: 0 issues.</w:t>
+      </w:r>
+    </w:p>
+    <w:p>
+      <w:pPr>
+        <w:spacing w:after="20"/>
       </w:pPr>
       <w:r>
         <w:rPr>
           <w:b/>
-          <w:sz w:val="22"/>
+          <w:color w:val="707070"/>
+          <w:sz w:val="20"/>
         </w:rPr>
-        <w:t>Код до исправления — scanPayments (payment_repo.go)</w:t>
+        <w:t>Код ДО — scanPayments (database/payment_repo.go):</w:t>
       </w:r>
     </w:p>
     <w:p>
       <w:pPr>
-        <w:shd w:val="clear" w:color="auto" w:fill="F2F2F2"/>
+        <w:shd w:val="clear" w:color="auto" w:fill="F0F0F0"/>
         <w:spacing w:before="40" w:after="40"/>
         <w:ind w:left="283"/>
       </w:pPr>
@@ -647,28 +704,29 @@
         </w:rPr>
         <w:t>for rows.Next() {</w:t>
         <w:br/>
-        <w:t xml:space="preserve">    // ... rows.Scan(...)</w:t>
+        <w:t xml:space="preserve">    rows.Scan(...)</w:t>
         <w:br/>
         <w:t>}</w:t>
         <w:br/>
-        <w:t>return payments, nil  // ошибка итерации молча игнорируется</w:t>
+        <w:t>return payments, nil  // ошибка итерации молча поглощается</w:t>
       </w:r>
     </w:p>
     <w:p>
       <w:pPr>
-        <w:spacing w:before="120" w:after="40"/>
+        <w:spacing w:after="20"/>
       </w:pPr>
       <w:r>
         <w:rPr>
           <w:b/>
-          <w:sz w:val="22"/>
+          <w:color w:val="707070"/>
+          <w:sz w:val="20"/>
         </w:rPr>
-        <w:t>Код после исправления</w:t>
+        <w:t>Код ПОСЛЕ:</w:t>
       </w:r>
     </w:p>
     <w:p>
       <w:pPr>
-        <w:shd w:val="clear" w:color="auto" w:fill="F2F2F2"/>
+        <w:shd w:val="clear" w:color="auto" w:fill="F0F0F0"/>
         <w:spacing w:before="40" w:after="40"/>
         <w:ind w:left="283"/>
       </w:pPr>
@@ -679,11 +737,11 @@
         </w:rPr>
         <w:t>for rows.Next() {</w:t>
         <w:br/>
-        <w:t xml:space="preserve">    // ... rows.Scan(...)</w:t>
+        <w:t xml:space="preserve">    rows.Scan(...)</w:t>
         <w:br/>
         <w:t>}</w:t>
         <w:br/>
-        <w:t>// FIX: CWE-703</w:t>
+        <w:t>// CWE-703: явная проверка ошибки итерации курсора</w:t>
         <w:br/>
         <w:t>if err := rows.Err(); err != nil {</w:t>
         <w:br/>
@@ -696,7 +754,7 @@
     </w:p>
     <w:p>
       <w:pPr>
-        <w:spacing w:before="160" w:after="40"/>
+        <w:spacing w:before="200" w:after="60"/>
       </w:pPr>
       <w:r>
         <w:rPr>
@@ -704,7 +762,7 @@
           <w:color w:val="2E74B5"/>
           <w:sz w:val="24"/>
         </w:rPr>
-        <w:t>2.3. Сравнение поведения до и после</w:t>
+        <w:t>2.3. Сравнение поведения до и после защиты</w:t>
       </w:r>
     </w:p>
     <w:tbl>
@@ -722,7 +780,7 @@
         <w:tc>
           <w:tcPr>
             <w:tcW w:type="dxa" w:w="3230"/>
-            <w:shd w:val="clear" w:color="auto" w:fill="BDD7EE"/>
+            <w:shd w:val="clear" w:color="auto" w:fill="C9DAF8"/>
           </w:tcPr>
           <w:p>
             <w:pPr>
@@ -739,7 +797,7 @@
         <w:tc>
           <w:tcPr>
             <w:tcW w:type="dxa" w:w="3230"/>
-            <w:shd w:val="clear" w:color="auto" w:fill="BDD7EE"/>
+            <w:shd w:val="clear" w:color="auto" w:fill="C9DAF8"/>
           </w:tcPr>
           <w:p>
             <w:pPr>
@@ -749,14 +807,14 @@
               <w:rPr>
                 <w:b/>
               </w:rPr>
-              <w:t>До усиления</w:t>
+              <w:t>До исправления</w:t>
             </w:r>
           </w:p>
         </w:tc>
         <w:tc>
           <w:tcPr>
             <w:tcW w:type="dxa" w:w="3230"/>
-            <w:shd w:val="clear" w:color="auto" w:fill="BDD7EE"/>
+            <w:shd w:val="clear" w:color="auto" w:fill="C9DAF8"/>
           </w:tcPr>
           <w:p>
             <w:pPr>
@@ -766,7 +824,7 @@
               <w:rPr>
                 <w:b/>
               </w:rPr>
-              <w:t>После усиления</w:t>
+              <w:t>После исправления</w:t>
             </w:r>
           </w:p>
         </w:tc>
@@ -781,7 +839,7 @@
               <w:jc w:val="left"/>
             </w:pPr>
             <w:r>
-              <w:t>POST /register c телом 500 МБ</w:t>
+              <w:t>POST /register с телом 500 МБ</w:t>
             </w:r>
           </w:p>
         </w:tc>
@@ -794,7 +852,7 @@
               <w:jc w:val="left"/>
             </w:pPr>
             <w:r>
-              <w:t>Сервер потребляет 500 МБ RAM, возможен OOM-crash</w:t>
+              <w:t>Сервер потребляет всю RAM → OOM crash</w:t>
             </w:r>
           </w:p>
         </w:tc>
@@ -807,7 +865,7 @@
               <w:jc w:val="left"/>
             </w:pPr>
             <w:r>
-              <w:t>Ответ 413 Request Entity Too Large; тело не читается</w:t>
+              <w:t>413 Request Entity Too Large, тело не читается</w:t>
             </w:r>
           </w:p>
         </w:tc>
@@ -835,7 +893,7 @@
               <w:jc w:val="left"/>
             </w:pPr>
             <w:r>
-              <w:t>Частичный результат возвращается без ошибки</w:t>
+              <w:t>Частичный результат, ошибка скрыта</w:t>
             </w:r>
           </w:p>
         </w:tc>
@@ -848,7 +906,7 @@
               <w:jc w:val="left"/>
             </w:pPr>
             <w:r>
-              <w:t>Ошибка rows.Err() возвращается → HTTP 500</w:t>
+              <w:t>rows.Err() → HTTP 500 с логированием</w:t>
             </w:r>
           </w:p>
         </w:tc>
@@ -863,7 +921,7 @@
               <w:jc w:val="left"/>
             </w:pPr>
             <w:r>
-              <w:t>GET /analyst (100 записей)</w:t>
+              <w:t>GET /analyst без пагинации</w:t>
             </w:r>
           </w:p>
         </w:tc>
@@ -876,7 +934,7 @@
               <w:jc w:val="left"/>
             </w:pPr>
             <w:r>
-              <w:t>Каждый запрос страницы загружает до 100 строк</w:t>
+              <w:t>До 100 строк на каждый запрос</w:t>
             </w:r>
           </w:p>
         </w:tc>
@@ -889,7 +947,7 @@
               <w:jc w:val="left"/>
             </w:pPr>
             <w:r>
-              <w:t>Загружается не более 50 строк</w:t>
+              <w:t>Не более 50 строк; остальное — по offset</w:t>
             </w:r>
           </w:p>
         </w:tc>
@@ -902,8 +960,7 @@
     </w:p>
     <w:p>
       <w:pPr>
-        <w:spacing w:before="240" w:after="80"/>
-        <w:jc w:val="left"/>
+        <w:spacing w:before="280" w:after="80"/>
       </w:pPr>
       <w:r>
         <w:rPr>
@@ -916,7 +973,19 @@
     </w:p>
     <w:p>
       <w:pPr>
-        <w:spacing w:before="160" w:after="40"/>
+        <w:spacing w:after="80"/>
+        <w:ind w:left="0"/>
+      </w:pPr>
+      <w:r>
+        <w:rPr>
+          <w:b w:val="0"/>
+        </w:rPr>
+        <w:t>Для бизнес-сценария «создание платежа пользователем» (POST /payments/new) построена карта доверительных границ и выявлены опасные точки назначения данных.</w:t>
+      </w:r>
+    </w:p>
+    <w:p>
+      <w:pPr>
+        <w:spacing w:before="200" w:after="60"/>
       </w:pPr>
       <w:r>
         <w:rPr>
@@ -924,54 +993,25 @@
           <w:color w:val="2E74B5"/>
           <w:sz w:val="24"/>
         </w:rPr>
-        <w:t>3.1. Карта доверительных границ (Trust Boundary Map)</w:t>
+        <w:t>3.1. Карта доверительных границ</w:t>
       </w:r>
     </w:p>
     <w:p>
       <w:pPr>
-        <w:ind w:left="0"/>
+        <w:spacing w:after="20"/>
       </w:pPr>
       <w:r>
-        <w:t>Бизнес-сценарий: пользователь создаёт платёж через веб-интерфейс POST /payments/new → WebHandler.CreatePayment.</w:t>
-      </w:r>
-    </w:p>
-    <w:p/>
-    <w:p>
-      <w:pPr>
-        <w:ind w:left="0"/>
-      </w:pPr>
-      <w:r>
-        <w:t>Граница 1 (Internet → Web Server): HTTP-запрос от браузера. Данные: amount, currency, recipient_id, description (form-data).</w:t>
+        <w:rPr>
+          <w:b/>
+          <w:color w:val="707070"/>
+          <w:sz w:val="20"/>
+        </w:rPr>
+        <w:t>Trust Boundary Map (нотация потока данных):</w:t>
       </w:r>
     </w:p>
     <w:p>
       <w:pPr>
-        <w:ind w:left="0"/>
-      </w:pPr>
-      <w:r>
-        <w:t>Граница 2 (Web Handler → Service Layer): после первичной валидации. Доверие: данные частично проверены, но не полностью нормализованы.</w:t>
-      </w:r>
-    </w:p>
-    <w:p>
-      <w:pPr>
-        <w:ind w:left="0"/>
-      </w:pPr>
-      <w:r>
-        <w:t>Граница 3 (Service → Repository → SQLite): параметризованные запросы. Доверие: высокое — только prepared statements.</w:t>
-      </w:r>
-    </w:p>
-    <w:p/>
-    <w:p>
-      <w:pPr>
-        <w:ind w:left="0"/>
-      </w:pPr>
-      <w:r>
-        <w:t>Схема потока (текстовая нотация):</w:t>
-      </w:r>
-    </w:p>
-    <w:p>
-      <w:pPr>
-        <w:shd w:val="clear" w:color="auto" w:fill="F2F2F2"/>
+        <w:shd w:val="clear" w:color="auto" w:fill="F0F0F0"/>
         <w:spacing w:before="40" w:after="40"/>
         <w:ind w:left="283"/>
       </w:pPr>
@@ -980,46 +1020,48 @@
           <w:rFonts w:ascii="Courier New" w:hAnsi="Courier New"/>
           <w:sz w:val="18"/>
         </w:rPr>
-        <w:t>Browser (HTTP POST)</w:t>
+        <w:t>Browser — HTTP POST /payments/new</w:t>
         <w:br/>
-        <w:t xml:space="preserve">  │  amount, currency, recipient_id, description</w:t>
+        <w:t xml:space="preserve">  │  Данные: amount, currency, recipient_id, description</w:t>
         <w:br/>
         <w:t xml:space="preserve">  ▼</w:t>
         <w:br/>
-        <w:t>[TB-1: Internet → App]</w:t>
+        <w:t>[Граница 1: Internet → Application]</w:t>
         <w:br/>
-        <w:t xml:space="preserve">  │  RateLimitMiddleware, MaxBodySizeMiddleware, SecurityHeaders</w:t>
+        <w:t xml:space="preserve">  │  RateLimitMiddleware · MaxBodySizeMiddleware · SecurityHeaders</w:t>
         <w:br/>
         <w:t xml:space="preserve">  ▼</w:t>
         <w:br/>
-        <w:t>WebHandler.CreatePayment  ← Source</w:t>
+        <w:t>WebHandler.CreatePayment             ← Source (недоверенный ввод)</w:t>
         <w:br/>
-        <w:t xml:space="preserve">  │  Validate: amount (float), currency (allowlist), recipientID (regex)</w:t>
+        <w:t xml:space="preserve">  │  Валидация: amount (float, 0–1M) · currency (allowlist)</w:t>
+        <w:br/>
+        <w:t xml:space="preserve">  │            recipient_id (regex ^[A-Z0-9]{8,20}$) · description (max 500)</w:t>
         <w:br/>
         <w:t xml:space="preserve">  ▼</w:t>
         <w:br/>
-        <w:t>[TB-2: Handler → Service]</w:t>
+        <w:t>[Граница 2: Handler → Service]</w:t>
         <w:br/>
         <w:t xml:space="preserve">  │  PaymentService.CreatePayment</w:t>
         <w:br/>
         <w:t xml:space="preserve">  ▼</w:t>
         <w:br/>
-        <w:t>[TB-3: Service → DB]</w:t>
+        <w:t>[Граница 3: Service → Repository → SQLite]</w:t>
         <w:br/>
         <w:t xml:space="preserve">  │  DB.CreatePayment → INSERT ... VALUES (?,?,?,?,?,?,?,?,?)</w:t>
         <w:br/>
         <w:t xml:space="preserve">  ▼</w:t>
         <w:br/>
-        <w:t>SQLite  ← Sink (SQL)</w:t>
+        <w:t>SQLite payments                       ← Sink 1 (SQL)</w:t>
         <w:br/>
-        <w:t xml:space="preserve">  │</w:t>
+        <w:t>AuditService.Log → audit_logs         ← Sink 2 (Audit Log)</w:t>
         <w:br/>
-        <w:t xml:space="preserve">  └─ AuditService.Log → audit_logs  ← Sink (Audit Log)</w:t>
+        <w:t>HTTP Response → browser               ← Sink 3 (Output)</w:t>
       </w:r>
     </w:p>
     <w:p>
       <w:pPr>
-        <w:spacing w:before="160" w:after="40"/>
+        <w:spacing w:before="200" w:after="60"/>
       </w:pPr>
       <w:r>
         <w:rPr>
@@ -1027,7 +1069,7 @@
           <w:color w:val="2E74B5"/>
           <w:sz w:val="24"/>
         </w:rPr>
-        <w:t>3.2. Таблица источников, распространения и sink'ов</w:t>
+        <w:t>3.2. Таблица: источник → распространение → sink → защита</w:t>
       </w:r>
     </w:p>
     <w:tbl>
@@ -1047,7 +1089,7 @@
         <w:tc>
           <w:tcPr>
             <w:tcW w:type="dxa" w:w="1938"/>
-            <w:shd w:val="clear" w:color="auto" w:fill="BDD7EE"/>
+            <w:shd w:val="clear" w:color="auto" w:fill="C9DAF8"/>
           </w:tcPr>
           <w:p>
             <w:pPr>
@@ -1064,7 +1106,7 @@
         <w:tc>
           <w:tcPr>
             <w:tcW w:type="dxa" w:w="1938"/>
-            <w:shd w:val="clear" w:color="auto" w:fill="BDD7EE"/>
+            <w:shd w:val="clear" w:color="auto" w:fill="C9DAF8"/>
           </w:tcPr>
           <w:p>
             <w:pPr>
@@ -1074,14 +1116,14 @@
               <w:rPr>
                 <w:b/>
               </w:rPr>
-              <w:t>Путь распространения</w:t>
+              <w:t>Путь</w:t>
             </w:r>
           </w:p>
         </w:tc>
         <w:tc>
           <w:tcPr>
             <w:tcW w:type="dxa" w:w="1938"/>
-            <w:shd w:val="clear" w:color="auto" w:fill="BDD7EE"/>
+            <w:shd w:val="clear" w:color="auto" w:fill="C9DAF8"/>
           </w:tcPr>
           <w:p>
             <w:pPr>
@@ -1098,7 +1140,7 @@
         <w:tc>
           <w:tcPr>
             <w:tcW w:type="dxa" w:w="1938"/>
-            <w:shd w:val="clear" w:color="auto" w:fill="BDD7EE"/>
+            <w:shd w:val="clear" w:color="auto" w:fill="C9DAF8"/>
           </w:tcPr>
           <w:p>
             <w:pPr>
@@ -1115,7 +1157,7 @@
         <w:tc>
           <w:tcPr>
             <w:tcW w:type="dxa" w:w="1938"/>
-            <w:shd w:val="clear" w:color="auto" w:fill="BDD7EE"/>
+            <w:shd w:val="clear" w:color="auto" w:fill="C9DAF8"/>
           </w:tcPr>
           <w:p>
             <w:pPr>
@@ -1125,7 +1167,7 @@
               <w:rPr>
                 <w:b/>
               </w:rPr>
-              <w:t>Мера защиты (после)</w:t>
+              <w:t>Защита (после)</w:t>
             </w:r>
           </w:p>
         </w:tc>
@@ -1170,7 +1212,7 @@
               <w:jc w:val="left"/>
             </w:pPr>
             <w:r>
-              <w:t>SQL (INSERT)</w:t>
+              <w:t>SQL INSERT</w:t>
             </w:r>
           </w:p>
         </w:tc>
@@ -1183,11 +1225,7 @@
               <w:jc w:val="left"/>
             </w:pPr>
             <w:r>
-              <w:t>CWE-20: только length check,</w:t>
-              <w:br/>
-              <w:t>не regex — пробелы и</w:t>
-              <w:br/>
-              <w:t>спецсимволы проходили</w:t>
+              <w:t>CWE-20: только length check (8–20), любые символы проходили</w:t>
             </w:r>
           </w:p>
         </w:tc>
@@ -1200,9 +1238,7 @@
               <w:jc w:val="left"/>
             </w:pPr>
             <w:r>
-              <w:t>Allowlist regex ^[A-Z0-9]{8,20}$</w:t>
-              <w:br/>
-              <w:t>(recipientIDPattern)</w:t>
+              <w:t>Allowlist regex ^[A-Z0-9]{8,20}$ (recipientIDPattern)</w:t>
             </w:r>
           </w:p>
         </w:tc>
@@ -1219,7 +1255,7 @@
             <w:r>
               <w:t>reason</w:t>
               <w:br/>
-              <w:t>(POST flag/reject form)</w:t>
+              <w:t>(flag/reject forms)</w:t>
             </w:r>
           </w:p>
         </w:tc>
@@ -1247,9 +1283,7 @@
               <w:jc w:val="left"/>
             </w:pPr>
             <w:r>
-              <w:t>SQL (UPDATE) +</w:t>
-              <w:br/>
-              <w:t>Audit Log</w:t>
+              <w:t>SQL UPDATE + Audit Log</w:t>
             </w:r>
           </w:p>
         </w:tc>
@@ -1262,9 +1296,7 @@
               <w:jc w:val="left"/>
             </w:pPr>
             <w:r>
-              <w:t>CWE-20: max-length отсутствовал;</w:t>
-              <w:br/>
-              <w:t>можно передать 100 КБ текста</w:t>
+              <w:t>CWE-20: max-length отсутствовал, возможна передача 100 КБ</w:t>
             </w:r>
           </w:p>
         </w:tc>
@@ -1277,9 +1309,7 @@
               <w:jc w:val="left"/>
             </w:pPr>
             <w:r>
-              <w:t>len(reason) &gt; 1000 → 400;</w:t>
-              <w:br/>
-              <w:t>ограничение в обоих обработчиках</w:t>
+              <w:t>len(reason) &gt; 1000 → 400 Bad Request</w:t>
             </w:r>
           </w:p>
         </w:tc>
@@ -1296,7 +1326,7 @@
             <w:r>
               <w:t>details, ip_address</w:t>
               <w:br/>
-              <w:t>(все audit.Log() вызовы)</w:t>
+              <w:t>(все вызовы Log())</w:t>
             </w:r>
           </w:p>
         </w:tc>
@@ -1326,9 +1356,7 @@
               <w:jc w:val="left"/>
             </w:pPr>
             <w:r>
-              <w:t>Audit Log (SQLite</w:t>
-              <w:br/>
-              <w:t>таблица audit_logs)</w:t>
+              <w:t>Audit Log (SQLite)</w:t>
             </w:r>
           </w:p>
         </w:tc>
@@ -1341,11 +1369,7 @@
               <w:jc w:val="left"/>
             </w:pPr>
             <w:r>
-              <w:t>CWE-117: пользователь мог</w:t>
-              <w:br/>
-              <w:t>внедрить \r\n через детали</w:t>
-              <w:br/>
-              <w:t>или заголовок X-Forwarded-For</w:t>
+              <w:t>CWE-117: символы \r\n позволяли вставить фиктивные строки в журнал</w:t>
             </w:r>
           </w:p>
         </w:tc>
@@ -1358,9 +1382,7 @@
               <w:jc w:val="left"/>
             </w:pPr>
             <w:r>
-              <w:t>sanitizeLogField() удаляет</w:t>
-              <w:br/>
-              <w:t>CR/LF/TAB, обрезает до 500 символов</w:t>
+              <w:t>sanitizeLogField() удаляет CR/LF/TAB, обрезает до 500 символов</w:t>
             </w:r>
           </w:p>
         </w:tc>
@@ -1377,7 +1399,7 @@
             <w:r>
               <w:t>paymentID</w:t>
               <w:br/>
-              <w:t>(URL param :id, web confirm)</w:t>
+              <w:t>(URL param :id)</w:t>
             </w:r>
           </w:p>
         </w:tc>
@@ -1392,9 +1414,7 @@
             <w:r>
               <w:t>c.Param("id") →</w:t>
               <w:br/>
-              <w:t>strconv.ParseInt (ошибка</w:t>
-              <w:br/>
-              <w:t>игнорировалась)</w:t>
+              <w:t>strconv.ParseInt (ошибка игнорировалась)</w:t>
             </w:r>
           </w:p>
         </w:tc>
@@ -1407,9 +1427,7 @@
               <w:jc w:val="left"/>
             </w:pPr>
             <w:r>
-              <w:t>PaymentService.ConfirmPayment</w:t>
-              <w:br/>
-              <w:t>→ DB.GetPaymentByID</w:t>
+              <w:t>PaymentService → DB</w:t>
             </w:r>
           </w:p>
         </w:tc>
@@ -1422,9 +1440,7 @@
               <w:jc w:val="left"/>
             </w:pPr>
             <w:r>
-              <w:t>CWE-703: ParseInt ошибка игнорирована;</w:t>
-              <w:br/>
-              <w:t>id=0 мог передаться в запрос</w:t>
+              <w:t>CWE-703: ParseInt ошибка поглощена; id=0 уходит в запрос</w:t>
             </w:r>
           </w:p>
         </w:tc>
@@ -1437,9 +1453,7 @@
               <w:jc w:val="left"/>
             </w:pPr>
             <w:r>
-              <w:t>Явная проверка err != nil</w:t>
-              <w:br/>
-              <w:t>и paymentID &lt;= 0 → 400</w:t>
+              <w:t>Явная проверка err != nil и paymentID &lt;= 0 → 400</w:t>
             </w:r>
           </w:p>
         </w:tc>
@@ -1454,9 +1468,9 @@
               <w:jc w:val="left"/>
             </w:pPr>
             <w:r>
-              <w:t>token JWT cookie</w:t>
+              <w:t>шаблон — ошибки рендеринга</w:t>
               <w:br/>
-              <w:t>(Set-Cookie при Login)</w:t>
+              <w:t>internal/web/handler.go</w:t>
             </w:r>
           </w:p>
         </w:tc>
@@ -1469,9 +1483,9 @@
               <w:jc w:val="left"/>
             </w:pPr>
             <w:r>
-              <w:t>authService.Login</w:t>
+              <w:t>template.ParseFS / ExecuteTemplate</w:t>
               <w:br/>
-              <w:t>→ c.SetCookie</w:t>
+              <w:t>→ c.String(500, err.Error())</w:t>
             </w:r>
           </w:p>
         </w:tc>
@@ -1484,9 +1498,7 @@
               <w:jc w:val="left"/>
             </w:pPr>
             <w:r>
-              <w:t>Cookie (браузер</w:t>
-              <w:br/>
-              <w:t>клиента)</w:t>
+              <w:t>HTTP Response (Output)</w:t>
             </w:r>
           </w:p>
         </w:tc>
@@ -1499,9 +1511,7 @@
               <w:jc w:val="left"/>
             </w:pPr>
             <w:r>
-              <w:t>CWE-614: Secure=false —</w:t>
-              <w:br/>
-              <w:t>cookie доступен по HTTP</w:t>
+              <w:t>CWE-209: полный текст ошибки Go с путями и именами раскрывался пользователю</w:t>
             </w:r>
           </w:p>
         </w:tc>
@@ -1514,9 +1524,7 @@
               <w:jc w:val="left"/>
             </w:pPr>
             <w:r>
-              <w:t>Secure=cfg.CookieSecure</w:t>
-              <w:br/>
-              <w:t>(по умолчанию true)</w:t>
+              <w:t>Заменено на generic «Internal server error»</w:t>
             </w:r>
           </w:p>
         </w:tc>
@@ -1524,7 +1532,7 @@
     </w:tbl>
     <w:p>
       <w:pPr>
-        <w:spacing w:before="160" w:after="40"/>
+        <w:spacing w:before="200" w:after="60"/>
       </w:pPr>
       <w:r>
         <w:rPr>
@@ -1532,7 +1540,7 @@
           <w:color w:val="2E74B5"/>
           <w:sz w:val="24"/>
         </w:rPr>
-        <w:t>3.3. Фрагменты исправленного кода</w:t>
+        <w:t>3.3. Исправления с фрагментами кода</w:t>
       </w:r>
     </w:p>
     <w:p>
@@ -1544,12 +1552,25 @@
           <w:b/>
           <w:sz w:val="22"/>
         </w:rPr>
-        <w:t>3.3.1 recipientID — allowlist-валидация (CWE-20)</w:t>
+        <w:t>3.3.1 Allowlist-валидация recipientID (CWE-20)</w:t>
       </w:r>
     </w:p>
     <w:p>
       <w:pPr>
-        <w:shd w:val="clear" w:color="auto" w:fill="F2F2F2"/>
+        <w:spacing w:after="20"/>
+      </w:pPr>
+      <w:r>
+        <w:rPr>
+          <w:b/>
+          <w:color w:val="707070"/>
+          <w:sz w:val="20"/>
+        </w:rPr>
+        <w:t>ДО:</w:t>
+      </w:r>
+    </w:p>
+    <w:p>
+      <w:pPr>
+        <w:shd w:val="clear" w:color="auto" w:fill="F0F0F0"/>
         <w:spacing w:before="40" w:after="40"/>
         <w:ind w:left="283"/>
       </w:pPr>
@@ -1558,13 +1579,13 @@
           <w:rFonts w:ascii="Courier New" w:hAnsi="Courier New"/>
           <w:sz w:val="18"/>
         </w:rPr>
-        <w:t>// ДО:</w:t>
-        <w:br/>
         <w:t>recipientID := strings.ToUpper(strings.TrimSpace(c.PostForm("recipient_id")))</w:t>
         <w:br/>
         <w:t>if len(recipientID) &lt; 8 || len(recipientID) &gt; 20 {</w:t>
         <w:br/>
-        <w:t xml:space="preserve">    c.String(http.StatusOK, `&lt;article class="flash error"&gt;...8-20 characters&lt;/article&gt;`)</w:t>
+        <w:t xml:space="preserve">    // любые символы, в том числе пробелы и спецсимволы — проходили</w:t>
+        <w:br/>
+        <w:t xml:space="preserve">    c.String(200, `&lt;article class="flash error"&gt;8-20 characters&lt;/article&gt;`)</w:t>
         <w:br/>
         <w:t xml:space="preserve">    return</w:t>
         <w:br/>
@@ -1573,7 +1594,20 @@
     </w:p>
     <w:p>
       <w:pPr>
-        <w:shd w:val="clear" w:color="auto" w:fill="F2F2F2"/>
+        <w:spacing w:after="20"/>
+      </w:pPr>
+      <w:r>
+        <w:rPr>
+          <w:b/>
+          <w:color w:val="707070"/>
+          <w:sz w:val="20"/>
+        </w:rPr>
+        <w:t>ПОСЛЕ:</w:t>
+      </w:r>
+    </w:p>
+    <w:p>
+      <w:pPr>
+        <w:shd w:val="clear" w:color="auto" w:fill="F0F0F0"/>
         <w:spacing w:before="40" w:after="40"/>
         <w:ind w:left="283"/>
       </w:pPr>
@@ -1582,15 +1616,14 @@
           <w:rFonts w:ascii="Courier New" w:hAnsi="Courier New"/>
           <w:sz w:val="18"/>
         </w:rPr>
-        <w:t>// ПОСЛЕ:</w:t>
+        <w:t>var recipientIDPattern = regexp.MustCompile(`^[A-Z0-9]{8,20}$`)</w:t>
         <w:br/>
-        <w:t>var recipientIDPattern = regexp.MustCompile(`^[A-Z0-9]{8,20}$`)</w:t>
         <w:br/>
         <w:t>recipientID := strings.ToUpper(strings.TrimSpace(c.PostForm("recipient_id")))</w:t>
         <w:br/>
         <w:t>if !recipientIDPattern.MatchString(recipientID) {</w:t>
         <w:br/>
-        <w:t xml:space="preserve">    c.String(http.StatusOK, `&lt;article class="flash error"&gt;Recipient ID: 8-20 uppercase alphanumeric&lt;/article&gt;`)</w:t>
+        <w:t xml:space="preserve">    c.String(200, `&lt;article class="flash error"&gt;Recipient ID: 8-20 uppercase alphanumeric&lt;/article&gt;`)</w:t>
         <w:br/>
         <w:t xml:space="preserve">    return</w:t>
         <w:br/>
@@ -1599,18 +1632,26 @@
     </w:p>
     <w:p>
       <w:pPr>
+        <w:spacing w:after="80"/>
         <w:ind w:left="0"/>
       </w:pPr>
       <w:r>
-        <w:t>Объяснение: до исправления допускались любые символы (включая пробел, кириллицу, управляющие символы). Теперь применяется тот же allowlist-паттерн, что и в API-валидаторе (validators.go), устраняя расхождение между API и Web-интерфейсом.</w:t>
+        <w:rPr>
+          <w:b w:val="0"/>
+        </w:rPr>
+        <w:t>Объяснение: до исправления длина проверялась, но состав символов — нет. Теперь применяется тот же паттерн ^[A-Z0-9]{8,20}$, что и в API-валидаторе (validators.go), устраняя расхождение между Web и API интерфейсами.</w:t>
       </w:r>
     </w:p>
     <w:p>
       <w:pPr>
+        <w:spacing w:after="80"/>
         <w:ind w:left="0"/>
       </w:pPr>
       <w:r>
-        <w:t>Подтверждение: POST /payments/new c recipient_id='&lt;script&gt;' возвращает ошибку 200 (flash), запись не создаётся. Gosec: 0 issues.</w:t>
+        <w:rPr>
+          <w:b w:val="0"/>
+        </w:rPr>
+        <w:t>CWE: CWE-20 (Improper Input Validation). Подтверждение: POSTing recipient_id='A B&lt;&gt;' → 400, запись не создаётся.</w:t>
       </w:r>
     </w:p>
     <w:p>
@@ -1622,12 +1663,25 @@
           <w:b/>
           <w:sz w:val="22"/>
         </w:rPr>
-        <w:t>3.3.2 Log injection — sanitizeLogField (CWE-117)</w:t>
+        <w:t>3.3.2 Раскрытие информации через ошибки шаблонов (CWE-209)</w:t>
       </w:r>
     </w:p>
     <w:p>
       <w:pPr>
-        <w:shd w:val="clear" w:color="auto" w:fill="F2F2F2"/>
+        <w:spacing w:after="20"/>
+      </w:pPr>
+      <w:r>
+        <w:rPr>
+          <w:b/>
+          <w:color w:val="707070"/>
+          <w:sz w:val="20"/>
+        </w:rPr>
+        <w:t>ДО:</w:t>
+      </w:r>
+    </w:p>
+    <w:p>
+      <w:pPr>
+        <w:shd w:val="clear" w:color="auto" w:fill="F0F0F0"/>
         <w:spacing w:before="40" w:after="40"/>
         <w:ind w:left="283"/>
       </w:pPr>
@@ -1636,20 +1690,43 @@
           <w:rFonts w:ascii="Courier New" w:hAnsi="Courier New"/>
           <w:sz w:val="18"/>
         </w:rPr>
-        <w:t>// ДО:</w:t>
+        <w:t>// internal/web/handler.go — функция render()</w:t>
         <w:br/>
-        <w:t>func (s *AuditService) Log(userID *int64, action AuditAction, resourceID *int64,</w:t>
+        <w:t>if err != nil {</w:t>
         <w:br/>
-        <w:t xml:space="preserve">        details, ipAddress string) {</w:t>
+        <w:t xml:space="preserve">    c.String(http.StatusInternalServerError,</w:t>
         <w:br/>
-        <w:t xml:space="preserve">    _ = s.db.CreateAuditLog(userID, action, resourceID, details, ipAddress)</w:t>
+        <w:t xml:space="preserve">        "Template parse error: "+err.Error())  // путь к файлу, имя шаблона — видны клиенту</w:t>
+        <w:br/>
+        <w:t>}</w:t>
+        <w:br/>
+        <w:t>// renderPartial()</w:t>
+        <w:br/>
+        <w:t>if err := h.templates.ExecuteTemplate(c.Writer, name, data); err != nil {</w:t>
+        <w:br/>
+        <w:t xml:space="preserve">    c.String(http.StatusInternalServerError,</w:t>
+        <w:br/>
+        <w:t xml:space="preserve">        "Template render error: "+err.Error())  // аналогично</w:t>
         <w:br/>
         <w:t>}</w:t>
       </w:r>
     </w:p>
     <w:p>
       <w:pPr>
-        <w:shd w:val="clear" w:color="auto" w:fill="F2F2F2"/>
+        <w:spacing w:after="20"/>
+      </w:pPr>
+      <w:r>
+        <w:rPr>
+          <w:b/>
+          <w:color w:val="707070"/>
+          <w:sz w:val="20"/>
+        </w:rPr>
+        <w:t>ПОСЛЕ:</w:t>
+      </w:r>
+    </w:p>
+    <w:p>
+      <w:pPr>
+        <w:shd w:val="clear" w:color="auto" w:fill="F0F0F0"/>
         <w:spacing w:before="40" w:after="40"/>
         <w:ind w:left="283"/>
       </w:pPr>
@@ -1658,8 +1735,117 @@
           <w:rFonts w:ascii="Courier New" w:hAnsi="Courier New"/>
           <w:sz w:val="18"/>
         </w:rPr>
-        <w:t>// ПОСЛЕ:</w:t>
+        <w:t>if err != nil {</w:t>
         <w:br/>
+        <w:t xml:space="preserve">    // CWE-209: только generic сообщение; детали пишутся в server-side лог</w:t>
+        <w:br/>
+        <w:t xml:space="preserve">    c.String(http.StatusInternalServerError, "Internal server error")</w:t>
+        <w:br/>
+        <w:t xml:space="preserve">    return</w:t>
+        <w:br/>
+        <w:t>}</w:t>
+        <w:br/>
+        <w:br/>
+        <w:t>if err := h.templates.ExecuteTemplate(c.Writer, name, data); err != nil {</w:t>
+        <w:br/>
+        <w:t xml:space="preserve">    c.String(http.StatusInternalServerError, "Internal server error")</w:t>
+        <w:br/>
+        <w:t>}</w:t>
+      </w:r>
+    </w:p>
+    <w:p>
+      <w:pPr>
+        <w:spacing w:after="80"/>
+        <w:ind w:left="0"/>
+      </w:pPr>
+      <w:r>
+        <w:rPr>
+          <w:b w:val="0"/>
+        </w:rPr>
+        <w:t>Объяснение: текст ошибки Go включает внутренние пути к файлам, имена переменных и трассировку. Передача этих данных клиенту помогает атакующему в разведке архитектуры приложения. Теперь клиент видит только «Internal server error»; полный текст ошибки должен писаться в структурированный server-side лог.</w:t>
+      </w:r>
+    </w:p>
+    <w:p>
+      <w:pPr>
+        <w:spacing w:after="80"/>
+        <w:ind w:left="0"/>
+      </w:pPr>
+      <w:r>
+        <w:rPr>
+          <w:b w:val="0"/>
+        </w:rPr>
+        <w:t>CWE: CWE-209 (Information Exposure Through an Error Message).</w:t>
+      </w:r>
+    </w:p>
+    <w:p>
+      <w:pPr>
+        <w:spacing w:before="120" w:after="40"/>
+      </w:pPr>
+      <w:r>
+        <w:rPr>
+          <w:b/>
+          <w:sz w:val="22"/>
+        </w:rPr>
+        <w:t>3.3.3 Log Injection — sanitizeLogField (CWE-117)</w:t>
+      </w:r>
+    </w:p>
+    <w:p>
+      <w:pPr>
+        <w:spacing w:after="20"/>
+      </w:pPr>
+      <w:r>
+        <w:rPr>
+          <w:b/>
+          <w:color w:val="707070"/>
+          <w:sz w:val="20"/>
+        </w:rPr>
+        <w:t>ДО:</w:t>
+      </w:r>
+    </w:p>
+    <w:p>
+      <w:pPr>
+        <w:shd w:val="clear" w:color="auto" w:fill="F0F0F0"/>
+        <w:spacing w:before="40" w:after="40"/>
+        <w:ind w:left="283"/>
+      </w:pPr>
+      <w:r>
+        <w:rPr>
+          <w:rFonts w:ascii="Courier New" w:hAnsi="Courier New"/>
+          <w:sz w:val="18"/>
+        </w:rPr>
+        <w:t>func (s *AuditService) Log(..., details, ipAddress string) {</w:t>
+        <w:br/>
+        <w:t xml:space="preserve">    _ = s.db.CreateAuditLog(userID, action, resourceID, details, ipAddress)</w:t>
+        <w:br/>
+        <w:t xml:space="preserve">    // ← CR/LF в details или ipAddress → поддельные строки в audit_logs</w:t>
+        <w:br/>
+        <w:t>}</w:t>
+      </w:r>
+    </w:p>
+    <w:p>
+      <w:pPr>
+        <w:spacing w:after="20"/>
+      </w:pPr>
+      <w:r>
+        <w:rPr>
+          <w:b/>
+          <w:color w:val="707070"/>
+          <w:sz w:val="20"/>
+        </w:rPr>
+        <w:t>ПОСЛЕ:</w:t>
+      </w:r>
+    </w:p>
+    <w:p>
+      <w:pPr>
+        <w:shd w:val="clear" w:color="auto" w:fill="F0F0F0"/>
+        <w:spacing w:before="40" w:after="40"/>
+        <w:ind w:left="283"/>
+      </w:pPr>
+      <w:r>
+        <w:rPr>
+          <w:rFonts w:ascii="Courier New" w:hAnsi="Courier New"/>
+          <w:sz w:val="18"/>
+        </w:rPr>
         <w:t>func sanitizeLogField(s string) string {</w:t>
         <w:br/>
         <w:t xml:space="preserve">    s = strings.ReplaceAll(s, "\r", "")</w:t>
@@ -1691,8 +1877,7 @@
     </w:p>
     <w:p>
       <w:pPr>
-        <w:spacing w:before="240" w:after="80"/>
-        <w:jc w:val="left"/>
+        <w:spacing w:before="280" w:after="80"/>
       </w:pPr>
       <w:r>
         <w:rPr>
@@ -1705,7 +1890,7 @@
     </w:p>
     <w:p>
       <w:pPr>
-        <w:spacing w:before="160" w:after="40"/>
+        <w:spacing w:before="200" w:after="60"/>
       </w:pPr>
       <w:r>
         <w:rPr>
@@ -1732,7 +1917,7 @@
         <w:tc>
           <w:tcPr>
             <w:tcW w:type="dxa" w:w="2422"/>
-            <w:shd w:val="clear" w:color="auto" w:fill="BDD7EE"/>
+            <w:shd w:val="clear" w:color="auto" w:fill="C9DAF8"/>
           </w:tcPr>
           <w:p>
             <w:pPr>
@@ -1749,7 +1934,7 @@
         <w:tc>
           <w:tcPr>
             <w:tcW w:type="dxa" w:w="2422"/>
-            <w:shd w:val="clear" w:color="auto" w:fill="BDD7EE"/>
+            <w:shd w:val="clear" w:color="auto" w:fill="C9DAF8"/>
           </w:tcPr>
           <w:p>
             <w:pPr>
@@ -1766,7 +1951,7 @@
         <w:tc>
           <w:tcPr>
             <w:tcW w:type="dxa" w:w="2422"/>
-            <w:shd w:val="clear" w:color="auto" w:fill="BDD7EE"/>
+            <w:shd w:val="clear" w:color="auto" w:fill="C9DAF8"/>
           </w:tcPr>
           <w:p>
             <w:pPr>
@@ -1783,7 +1968,7 @@
         <w:tc>
           <w:tcPr>
             <w:tcW w:type="dxa" w:w="2422"/>
-            <w:shd w:val="clear" w:color="auto" w:fill="BDD7EE"/>
+            <w:shd w:val="clear" w:color="auto" w:fill="C9DAF8"/>
           </w:tcPr>
           <w:p>
             <w:pPr>
@@ -2395,7 +2580,7 @@
     </w:tbl>
     <w:p>
       <w:pPr>
-        <w:spacing w:before="160" w:after="40"/>
+        <w:spacing w:before="200" w:after="60"/>
       </w:pPr>
       <w:r>
         <w:rPr>
@@ -2403,7 +2588,7 @@
           <w:color w:val="2E74B5"/>
           <w:sz w:val="24"/>
         </w:rPr>
-        <w:t>4.2. Перечень криптографических и authorization-рисков</w:t>
+        <w:t>4.2. Выявленные риски в области аутентификации и криптографии</w:t>
       </w:r>
     </w:p>
     <w:tbl>
@@ -2422,7 +2607,7 @@
         <w:tc>
           <w:tcPr>
             <w:tcW w:type="dxa" w:w="2422"/>
-            <w:shd w:val="clear" w:color="auto" w:fill="BDD7EE"/>
+            <w:shd w:val="clear" w:color="auto" w:fill="C9DAF8"/>
           </w:tcPr>
           <w:p>
             <w:pPr>
@@ -2439,7 +2624,7 @@
         <w:tc>
           <w:tcPr>
             <w:tcW w:type="dxa" w:w="2422"/>
-            <w:shd w:val="clear" w:color="auto" w:fill="BDD7EE"/>
+            <w:shd w:val="clear" w:color="auto" w:fill="C9DAF8"/>
           </w:tcPr>
           <w:p>
             <w:pPr>
@@ -2456,7 +2641,7 @@
         <w:tc>
           <w:tcPr>
             <w:tcW w:type="dxa" w:w="2422"/>
-            <w:shd w:val="clear" w:color="auto" w:fill="BDD7EE"/>
+            <w:shd w:val="clear" w:color="auto" w:fill="C9DAF8"/>
           </w:tcPr>
           <w:p>
             <w:pPr>
@@ -2473,7 +2658,7 @@
         <w:tc>
           <w:tcPr>
             <w:tcW w:type="dxa" w:w="2422"/>
-            <w:shd w:val="clear" w:color="auto" w:fill="BDD7EE"/>
+            <w:shd w:val="clear" w:color="auto" w:fill="C9DAF8"/>
           </w:tcPr>
           <w:p>
             <w:pPr>
@@ -2511,7 +2696,7 @@
               <w:jc w:val="left"/>
             </w:pPr>
             <w:r>
-              <w:t>JWT Secure cookie flag = false (HTTP)</w:t>
+              <w:t>JWT cookie Secure=false — токен передаётся по HTTP открытым текстом</w:t>
             </w:r>
           </w:p>
         </w:tc>
@@ -2537,7 +2722,7 @@
               <w:jc w:val="left"/>
             </w:pPr>
             <w:r>
-              <w:t>ИСПРАВЛЕНО: cfg.CookieSecure</w:t>
+              <w:t>ИСПРАВЛЕНО: cfg.CookieSecure из переменной окружения COOKIE_SECURE</w:t>
             </w:r>
           </w:p>
         </w:tc>
@@ -2565,7 +2750,7 @@
               <w:jc w:val="left"/>
             </w:pPr>
             <w:r>
-              <w:t>Отсутствие jti в JWT — невозможно отозвать отдельный токен</w:t>
+              <w:t>Отсутствие jti в JWT — невозможно отозвать конкретный токен без отзыва всех</w:t>
             </w:r>
           </w:p>
         </w:tc>
@@ -2591,7 +2776,7 @@
               <w:jc w:val="left"/>
             </w:pPr>
             <w:r>
-              <w:t>ИСПРАВЛЕНО: jti = crypto/rand 16 байт</w:t>
+              <w:t>ИСПРАВЛЕНО: jti = 16 случайных байт (crypto/rand), Base16</w:t>
             </w:r>
           </w:p>
         </w:tc>
@@ -2619,7 +2804,7 @@
               <w:jc w:val="left"/>
             </w:pPr>
             <w:r>
-              <w:t>Роль в JWT не re-валидируется по БД — смена роли вступает в силу только после истечения токена</w:t>
+              <w:t>Роль из JWT не перепроверяется по БД — смена роли вступает в силу только после истечения токена</w:t>
             </w:r>
           </w:p>
         </w:tc>
@@ -2645,7 +2830,7 @@
               <w:jc w:val="left"/>
             </w:pPr>
             <w:r>
-              <w:t>ПРИНЯТО: срок жизни 15 минут; TODO: token revocation list</w:t>
+              <w:t>ПРИНЯТО: TTL 15 мин; TODO: revocation list</w:t>
             </w:r>
           </w:p>
         </w:tc>
@@ -2673,7 +2858,7 @@
               <w:jc w:val="left"/>
             </w:pPr>
             <w:r>
-              <w:t>Нет механизма блокировки аккаунта при брутфорсе (только IP rate limit)</w:t>
+              <w:t>Нет per-user блокировки после N неудачных попыток входа — только IP rate limit</w:t>
             </w:r>
           </w:p>
         </w:tc>
@@ -2727,7 +2912,7 @@
               <w:jc w:val="left"/>
             </w:pPr>
             <w:r>
-              <w:t>bcrypt.DefaultCost (10) — приемлем, но не адаптируется к росту мощности CPU</w:t>
+              <w:t>bcrypt.DefaultCost (10) не адаптируется к росту мощности CPU</w:t>
             </w:r>
           </w:p>
         </w:tc>
@@ -2753,61 +2938,7 @@
               <w:jc w:val="left"/>
             </w:pPr>
             <w:r>
-              <w:t>ПРИНЯТО: для MVP допустимо; рекомендация: использовать bcrypt.MinCost+2</w:t>
-            </w:r>
-          </w:p>
-        </w:tc>
-      </w:tr>
-      <w:tr>
-        <w:tc>
-          <w:tcPr>
-            <w:tcW w:type="dxa" w:w="2422"/>
-          </w:tcPr>
-          <w:p>
-            <w:pPr>
-              <w:jc w:val="left"/>
-            </w:pPr>
-            <w:r>
-              <w:t>6</w:t>
-            </w:r>
-          </w:p>
-        </w:tc>
-        <w:tc>
-          <w:tcPr>
-            <w:tcW w:type="dxa" w:w="2422"/>
-          </w:tcPr>
-          <w:p>
-            <w:pPr>
-              <w:jc w:val="left"/>
-            </w:pPr>
-            <w:r>
-              <w:t>JWT подписывается HMAC-SHA256 — симметричный ключ, хранится в .env</w:t>
-            </w:r>
-          </w:p>
-        </w:tc>
-        <w:tc>
-          <w:tcPr>
-            <w:tcW w:type="dxa" w:w="2422"/>
-          </w:tcPr>
-          <w:p>
-            <w:pPr>
-              <w:jc w:val="left"/>
-            </w:pPr>
-            <w:r>
-              <w:t>CWE-321</w:t>
-            </w:r>
-          </w:p>
-        </w:tc>
-        <w:tc>
-          <w:tcPr>
-            <w:tcW w:type="dxa" w:w="2422"/>
-          </w:tcPr>
-          <w:p>
-            <w:pPr>
-              <w:jc w:val="left"/>
-            </w:pPr>
-            <w:r>
-              <w:t>ПРИНЯТО: .env не коммитится; рекомендация: Vault/HSM в продакшне</w:t>
+              <w:t>ПРИНЯТО: приемлемо для MVP; рекомендация: Cost 12 в продакшне</w:t>
             </w:r>
           </w:p>
         </w:tc>
@@ -2815,7 +2946,7 @@
     </w:tbl>
     <w:p>
       <w:pPr>
-        <w:spacing w:before="160" w:after="40"/>
+        <w:spacing w:before="200" w:after="60"/>
       </w:pPr>
       <w:r>
         <w:rPr>
@@ -2840,7 +2971,7 @@
     </w:p>
     <w:p>
       <w:pPr>
-        <w:shd w:val="clear" w:color="auto" w:fill="F2F2F2"/>
+        <w:shd w:val="clear" w:color="auto" w:fill="F0F0F0"/>
         <w:spacing w:before="40" w:after="40"/>
         <w:ind w:left="283"/>
       </w:pPr>
@@ -2854,15 +2985,15 @@
         <w:t>Authorization: Bearer &lt;valid_analyst_token&gt;</w:t>
         <w:br/>
         <w:br/>
-        <w:t>1. AuthMiddleware: JWT parsed → claims{UserID:2, Role:fraud_analyst} → OK</w:t>
+        <w:t>1. AuthMiddleware: JWT parsed → {UserID:2, Role:fraud_analyst}   OK</w:t>
         <w:br/>
         <w:t>2. PaymentHandler.GetPayment → PaymentService.GetPayment(42, 2, fraud_analyst)</w:t>
         <w:br/>
-        <w:t>3. userRole == RoleFraudAnalyst → bypass owner check</w:t>
+        <w:t>3. userRole == RoleFraudAnalyst → owner check обходится (по дизайну)</w:t>
         <w:br/>
-        <w:t>4. AuditLog: action=payment_viewed, resource_id=42</w:t>
+        <w:t>4. AuditLog: action=payment_viewed, resource_id=42, ip=...</w:t>
         <w:br/>
-        <w:t>5. → 200 OK (analyst response со fraud_score)</w:t>
+        <w:t>5. ← 200 OK (analyst response, включает fraud_score)</w:t>
       </w:r>
     </w:p>
     <w:p>
@@ -2879,7 +3010,7 @@
     </w:p>
     <w:p>
       <w:pPr>
-        <w:shd w:val="clear" w:color="auto" w:fill="F2F2F2"/>
+        <w:shd w:val="clear" w:color="auto" w:fill="F0F0F0"/>
         <w:spacing w:before="40" w:after="40"/>
         <w:ind w:left="283"/>
       </w:pPr>
@@ -2892,23 +3023,23 @@
         <w:br/>
         <w:t>Authorization: Bearer &lt;valid_user_token&gt;  (UserID=5)</w:t>
         <w:br/>
-        <w:t>Payment 99 belongs to UserID=7</w:t>
+        <w:t>Payment #99 принадлежит UserID=7</w:t>
         <w:br/>
         <w:br/>
-        <w:t>1. AuthMiddleware: JWT valid → claims{UserID:5, Role:user} → OK</w:t>
+        <w:t>1. AuthMiddleware: JWT valid → {UserID:5, Role:user}             OK</w:t>
         <w:br/>
         <w:t>2. PaymentService.ConfirmPayment(99, 5)</w:t>
         <w:br/>
         <w:t>3. DB.GetPaymentByID(99) → payment.UserID = 7</w:t>
         <w:br/>
-        <w:t>4. payment.UserID (7) != userID (5) → ErrUnauthorizedAccess</w:t>
+        <w:t>4. payment.UserID(7) != userID(5) → ErrUnauthorizedAccess</w:t>
         <w:br/>
-        <w:t>5. Handler → 403 Forbidden {"error":"access denied"}</w:t>
+        <w:t>5. ← 403 Forbidden {"error": "access denied"}</w:t>
       </w:r>
     </w:p>
     <w:p>
       <w:pPr>
-        <w:spacing w:before="160" w:after="40"/>
+        <w:spacing w:before="200" w:after="60"/>
       </w:pPr>
       <w:r>
         <w:rPr>
@@ -2916,7 +3047,7 @@
           <w:color w:val="2E74B5"/>
           <w:sz w:val="24"/>
         </w:rPr>
-        <w:t>4.4. Исправления — код до/после</w:t>
+        <w:t>4.4. Исправления</w:t>
       </w:r>
     </w:p>
     <w:p>
@@ -2928,12 +3059,25 @@
           <w:b/>
           <w:sz w:val="22"/>
         </w:rPr>
-        <w:t>4.4.1 Cookie Secure flag (CWE-614)</w:t>
+        <w:t>4.4.1 Cookie Secure flag из конфигурации (CWE-614)</w:t>
       </w:r>
     </w:p>
     <w:p>
       <w:pPr>
-        <w:shd w:val="clear" w:color="auto" w:fill="F2F2F2"/>
+        <w:spacing w:after="20"/>
+      </w:pPr>
+      <w:r>
+        <w:rPr>
+          <w:b/>
+          <w:color w:val="707070"/>
+          <w:sz w:val="20"/>
+        </w:rPr>
+        <w:t>ДО (internal/web/handler.go):</w:t>
+      </w:r>
+    </w:p>
+    <w:p>
+      <w:pPr>
+        <w:shd w:val="clear" w:color="auto" w:fill="F0F0F0"/>
         <w:spacing w:before="40" w:after="40"/>
         <w:ind w:left="283"/>
       </w:pPr>
@@ -2942,16 +3086,27 @@
           <w:rFonts w:ascii="Courier New" w:hAnsi="Courier New"/>
           <w:sz w:val="18"/>
         </w:rPr>
-        <w:t>// ДО (internal/web/handler.go):</w:t>
-        <w:br/>
         <w:t>c.SetCookie("token", token, 900, "/", "", false, true)</w:t>
         <w:br/>
-        <w:t>//                                           ^^^^^ Secure=false всегда</w:t>
+        <w:t>//                                           ^^^^^ жёстко false</w:t>
       </w:r>
     </w:p>
     <w:p>
       <w:pPr>
-        <w:shd w:val="clear" w:color="auto" w:fill="F2F2F2"/>
+        <w:spacing w:after="20"/>
+      </w:pPr>
+      <w:r>
+        <w:rPr>
+          <w:b/>
+          <w:color w:val="707070"/>
+          <w:sz w:val="20"/>
+        </w:rPr>
+        <w:t>ПОСЛЕ:</w:t>
+      </w:r>
+    </w:p>
+    <w:p>
+      <w:pPr>
+        <w:shd w:val="clear" w:color="auto" w:fill="F0F0F0"/>
         <w:spacing w:before="40" w:after="40"/>
         <w:ind w:left="283"/>
       </w:pPr>
@@ -2960,15 +3115,13 @@
           <w:rFonts w:ascii="Courier New" w:hAnsi="Courier New"/>
           <w:sz w:val="18"/>
         </w:rPr>
-        <w:t>// ПОСЛЕ:</w:t>
-        <w:br/>
         <w:t>// internal/config/config.go:</w:t>
         <w:br/>
         <w:t>type Config struct {</w:t>
         <w:br/>
         <w:t xml:space="preserve">    ...</w:t>
         <w:br/>
-        <w:t xml:space="preserve">    CookieSecure bool  // из переменной окружения COOKIE_SECURE (default: true)</w:t>
+        <w:t xml:space="preserve">    CookieSecure bool // из COOKIE_SECURE (по умолчанию true)</w:t>
         <w:br/>
         <w:t>}</w:t>
         <w:br/>
@@ -2977,15 +3130,19 @@
         <w:br/>
         <w:t>c.SetCookie("token", token, 900, "/", "", h.cookieSecure, true)</w:t>
         <w:br/>
-        <w:t>//                                           ^^^^^^^^^^^^^^ из конфига</w:t>
+        <w:t>//                                         ^^^^^^^^^^^^^^</w:t>
       </w:r>
     </w:p>
     <w:p>
       <w:pPr>
+        <w:spacing w:after="80"/>
         <w:ind w:left="0"/>
       </w:pPr>
       <w:r>
-        <w:t>Подтверждение: при COOKIE_SECURE=true в ответе Set-Cookie присутствует атрибут Secure; curl через HTTP не получит cookie с Secure=true при корректной HTTPS-настройке.</w:t>
+        <w:rPr>
+          <w:b w:val="0"/>
+        </w:rPr>
+        <w:t>Объяснение: ранее флаг Secure был жёстко равен false, что означало передачу cookie по незашифрованному HTTP. Теперь значение берётся из конфигурации — в production всегда true (HTTPS), в dev-среде можно временно выставить false без изменения кода.</w:t>
       </w:r>
     </w:p>
     <w:p>
@@ -2997,12 +3154,25 @@
           <w:b/>
           <w:sz w:val="22"/>
         </w:rPr>
-        <w:t>4.4.2 JWT ID claim (CWE-613)</w:t>
+        <w:t>4.4.2 JWT ID (jti) для будущего отзыва токенов (CWE-613)</w:t>
       </w:r>
     </w:p>
     <w:p>
       <w:pPr>
-        <w:shd w:val="clear" w:color="auto" w:fill="F2F2F2"/>
+        <w:spacing w:after="20"/>
+      </w:pPr>
+      <w:r>
+        <w:rPr>
+          <w:b/>
+          <w:color w:val="707070"/>
+          <w:sz w:val="20"/>
+        </w:rPr>
+        <w:t>ДО:</w:t>
+      </w:r>
+    </w:p>
+    <w:p>
+      <w:pPr>
+        <w:shd w:val="clear" w:color="auto" w:fill="F0F0F0"/>
         <w:spacing w:before="40" w:after="40"/>
         <w:ind w:left="283"/>
       </w:pPr>
@@ -3011,15 +3181,13 @@
           <w:rFonts w:ascii="Courier New" w:hAnsi="Courier New"/>
           <w:sz w:val="18"/>
         </w:rPr>
-        <w:t>// ДО (internal/services/auth_service.go):</w:t>
-        <w:br/>
         <w:t>claims := Claims{</w:t>
         <w:br/>
         <w:t xml:space="preserve">    RegisteredClaims: jwt.RegisteredClaims{</w:t>
         <w:br/>
         <w:t xml:space="preserve">        ExpiresAt: ..., IssuedAt: ..., Subject: user.Email,</w:t>
         <w:br/>
-        <w:t xml:space="preserve">        // ID отсутствует — токены одного пользователя неразличимы</w:t>
+        <w:t xml:space="preserve">        // ID отсутствует — все токены одного пользователя неразличимы</w:t>
         <w:br/>
         <w:t xml:space="preserve">    },</w:t>
         <w:br/>
@@ -3028,7 +3196,20 @@
     </w:p>
     <w:p>
       <w:pPr>
-        <w:shd w:val="clear" w:color="auto" w:fill="F2F2F2"/>
+        <w:spacing w:after="20"/>
+      </w:pPr>
+      <w:r>
+        <w:rPr>
+          <w:b/>
+          <w:color w:val="707070"/>
+          <w:sz w:val="20"/>
+        </w:rPr>
+        <w:t>ПОСЛЕ:</w:t>
+      </w:r>
+    </w:p>
+    <w:p>
+      <w:pPr>
+        <w:shd w:val="clear" w:color="auto" w:fill="F0F0F0"/>
         <w:spacing w:before="40" w:after="40"/>
         <w:ind w:left="283"/>
       </w:pPr>
@@ -3037,11 +3218,9 @@
           <w:rFonts w:ascii="Courier New" w:hAnsi="Courier New"/>
           <w:sz w:val="18"/>
         </w:rPr>
-        <w:t>// ПОСЛЕ:</w:t>
-        <w:br/>
         <w:t>jtiBytes := make([]byte, 16)</w:t>
         <w:br/>
-        <w:t>rand.Read(jtiBytes)</w:t>
+        <w:t>rand.Read(jtiBytes)  // crypto/rand</w:t>
         <w:br/>
         <w:t>jti := hex.EncodeToString(jtiBytes)</w:t>
         <w:br/>
@@ -3052,7 +3231,7 @@
         <w:br/>
         <w:t xml:space="preserve">        ExpiresAt: ..., IssuedAt: ..., Subject: user.Email,</w:t>
         <w:br/>
-        <w:t xml:space="preserve">        ID: jti,  // уникальный UUID-подобный идентификатор токена</w:t>
+        <w:t xml:space="preserve">        ID: jti,  // уникальный 32-символьный hex-идентификатор</w:t>
         <w:br/>
         <w:t xml:space="preserve">    },</w:t>
         <w:br/>
@@ -3061,63 +3240,19 @@
     </w:p>
     <w:p>
       <w:pPr>
-        <w:spacing w:before="120" w:after="40"/>
+        <w:spacing w:after="80"/>
+        <w:ind w:left="0"/>
       </w:pPr>
       <w:r>
         <w:rPr>
-          <w:b/>
-          <w:sz w:val="22"/>
+          <w:b w:val="0"/>
         </w:rPr>
-        <w:t>4.4.3 Исправление игнорируемой ошибки ParseInt в ConfirmPayment (CWE-703)</w:t>
+        <w:t>Объяснение: поле jti (JWT ID) делает каждый выданный токен уникальным. Это закладывает основу для реализации revocation list — при компрометации токена достаточно внести его jti в чёрный список, не трогая остальные.</w:t>
       </w:r>
     </w:p>
     <w:p>
       <w:pPr>
-        <w:shd w:val="clear" w:color="auto" w:fill="F2F2F2"/>
-        <w:spacing w:before="40" w:after="40"/>
-        <w:ind w:left="283"/>
-      </w:pPr>
-      <w:r>
-        <w:rPr>
-          <w:rFonts w:ascii="Courier New" w:hAnsi="Courier New"/>
-          <w:sz w:val="18"/>
-        </w:rPr>
-        <w:t>// ДО:</w:t>
-        <w:br/>
-        <w:t>paymentID, _ := strconv.ParseInt(c.Param("id"), 10, 64)</w:t>
-        <w:br/>
-        <w:t>err := h.paymentService.ConfirmPayment(paymentID, user.UserID)</w:t>
-      </w:r>
-    </w:p>
-    <w:p>
-      <w:pPr>
-        <w:shd w:val="clear" w:color="auto" w:fill="F2F2F2"/>
-        <w:spacing w:before="40" w:after="40"/>
-        <w:ind w:left="283"/>
-      </w:pPr>
-      <w:r>
-        <w:rPr>
-          <w:rFonts w:ascii="Courier New" w:hAnsi="Courier New"/>
-          <w:sz w:val="18"/>
-        </w:rPr>
-        <w:t>// ПОСЛЕ:</w:t>
-        <w:br/>
-        <w:t>paymentID, err := strconv.ParseInt(c.Param("id"), 10, 64)</w:t>
-        <w:br/>
-        <w:t>if err != nil || paymentID &lt;= 0 {</w:t>
-        <w:br/>
-        <w:t xml:space="preserve">    c.String(http.StatusBadRequest, `&lt;p class="error"&gt;Invalid payment ID&lt;/p&gt;`)</w:t>
-        <w:br/>
-        <w:t xml:space="preserve">    return</w:t>
-        <w:br/>
-        <w:t>}</w:t>
-        <w:br/>
-        <w:t>err = h.paymentService.ConfirmPayment(paymentID, user.UserID)</w:t>
-      </w:r>
-    </w:p>
-    <w:p>
-      <w:pPr>
-        <w:spacing w:before="160" w:after="40"/>
+        <w:spacing w:before="200" w:after="60"/>
       </w:pPr>
       <w:r>
         <w:rPr>
@@ -3125,31 +3260,31 @@
           <w:color w:val="2E74B5"/>
           <w:sz w:val="24"/>
         </w:rPr>
-        <w:t>4.5. Архитектурное обоснование</w:t>
+        <w:t>4.5. Архитектурные обоснования</w:t>
       </w:r>
     </w:p>
     <w:p>
       <w:pPr>
+        <w:spacing w:after="80"/>
         <w:ind w:left="0"/>
       </w:pPr>
       <w:r>
-        <w:t>1. Роль хранится в JWT, а не перечитывается из БД при каждом запросе. Это архитектурный компромисс: снижение нагрузки на БД vs задержка применения смены роли. Для MVP с 15-минутным TTL токена — приемлемо. В продакшне рекомендуется token introspection или revocation list в Redis.</w:t>
+        <w:rPr>
+          <w:b w:val="0"/>
+        </w:rPr>
+        <w:t>Роль пользователя хранится прямо в JWT и не перечитывается из БД при каждом запросе. Это сознательный архитектурный выбор: снижение нагрузки на SQLite важнее мгновенной реакции на смену роли. При TTL 15 минут окно уязвимости минимально. В продакшне стоит добавить Redis-список отозванных jti.</w:t>
       </w:r>
     </w:p>
     <w:p>
       <w:pPr>
+        <w:spacing w:after="80"/>
         <w:ind w:left="0"/>
       </w:pPr>
       <w:r>
-        <w:t>2. bcrypt.DefaultCost (10) обеспечивает ~100 мс на хеш. При необходимости переноса на более мощный сервер следует увеличить Cost до 12–13.</w:t>
-      </w:r>
-    </w:p>
-    <w:p>
-      <w:pPr>
-        <w:ind w:left="0"/>
-      </w:pPr>
-      <w:r>
-        <w:t>3. jti позволяет в будущем реализовать мгновенный отзыв токенов через таблицу revoked_tokens без перевыпуска всей архитектуры.</w:t>
+        <w:rPr>
+          <w:b w:val="0"/>
+        </w:rPr>
+        <w:t>bcrypt.DefaultCost (10) обеспечивает ~100 мс на хеш — достаточно для MVP. При переносе на современный многоядерный сервер рекомендуется повысить Cost до 12–13 и провести нагрузочное тестирование эндпоинтов аутентификации.</w:t>
       </w:r>
     </w:p>
     <w:p>
@@ -3159,8 +3294,7 @@
     </w:p>
     <w:p>
       <w:pPr>
-        <w:spacing w:before="240" w:after="80"/>
-        <w:jc w:val="left"/>
+        <w:spacing w:before="280" w:after="80"/>
       </w:pPr>
       <w:r>
         <w:rPr>
@@ -3173,7 +3307,19 @@
     </w:p>
     <w:p>
       <w:pPr>
-        <w:spacing w:before="160" w:after="40"/>
+        <w:spacing w:after="80"/>
+        <w:ind w:left="0"/>
+      </w:pPr>
+      <w:r>
+        <w:rPr>
+          <w:b w:val="0"/>
+        </w:rPr>
+        <w:t>Для задания 4 выбраны 5 уязвимостей, не совпадающих с рассмотренными в ПР №4. Напомним, что ПР №4 охватывало: CWE-703 (ExecuteTemplate G104), CWE-614 (Cookie Secure), CWE-89 (SQL Injection), CWE-79 (XSS) и CWE-521 (слабая политика паролей). Все пять уязвимостей ниже — новые.</w:t>
+      </w:r>
+    </w:p>
+    <w:p>
+      <w:pPr>
+        <w:spacing w:before="200" w:after="60"/>
       </w:pPr>
       <w:r>
         <w:rPr>
@@ -3181,20 +3327,132 @@
           <w:color w:val="2E74B5"/>
           <w:sz w:val="24"/>
         </w:rPr>
-        <w:t>5.1. Выбранные уязвимости (не повторяющиеся из ПР №4)</w:t>
+        <w:t>5.1. Описание уязвимостей</w:t>
       </w:r>
     </w:p>
     <w:p>
       <w:pPr>
-        <w:ind w:left="0"/>
+        <w:spacing w:before="120" w:after="40"/>
       </w:pPr>
       <w:r>
-        <w:t>В ПР №4 были рассмотрены: G104/CWE-703 (ExecuteTemplate), CWE-521 (пароль), SQLi, XSS, Path Traversal, Command Injection. Для ПР №5 выбраны 5 новых уязвимостей.</w:t>
+        <w:rPr>
+          <w:b/>
+          <w:sz w:val="22"/>
+        </w:rPr>
+        <w:t>Уязвимость 1 — CWE-400: DoS через неограниченное тело запроса</w:t>
       </w:r>
     </w:p>
     <w:p>
       <w:pPr>
-        <w:spacing w:before="160" w:after="40"/>
+        <w:spacing w:after="80"/>
+        <w:ind w:left="0"/>
+      </w:pPr>
+      <w:r>
+        <w:rPr>
+          <w:b w:val="0"/>
+        </w:rPr>
+        <w:t>Модуль: cmd/server/main.go (все POST-эндпоинты). Точка входа: тело HTTP-запроса. Sink: оперативная память процесса (буфер Gin). До исправления любой анонимный пользователь мог отправить тело произвольного размера и вызвать OOM-crash сервера.</w:t>
+      </w:r>
+    </w:p>
+    <w:p>
+      <w:pPr>
+        <w:spacing w:before="120" w:after="40"/>
+      </w:pPr>
+      <w:r>
+        <w:rPr>
+          <w:b/>
+          <w:sz w:val="22"/>
+        </w:rPr>
+        <w:t>Уязвимость 2 — CWE-613: Отсутствие jti / невозможность отзыва JWT</w:t>
+      </w:r>
+    </w:p>
+    <w:p>
+      <w:pPr>
+        <w:spacing w:after="80"/>
+        <w:ind w:left="0"/>
+      </w:pPr>
+      <w:r>
+        <w:rPr>
+          <w:b w:val="0"/>
+        </w:rPr>
+        <w:t>Модуль: internal/services/auth_service.go. Точка входа: POST /api/v1/auth/login. Sink: JWT-токен (выдаётся клиенту). Без поля jti все токены одного пользователя идентичны — при утечке токена его невозможно инвалидировать без перевыпуска секретного ключа (что аннулирует все сессии).</w:t>
+      </w:r>
+    </w:p>
+    <w:p>
+      <w:pPr>
+        <w:spacing w:before="120" w:after="40"/>
+      </w:pPr>
+      <w:r>
+        <w:rPr>
+          <w:b/>
+          <w:sz w:val="22"/>
+        </w:rPr>
+        <w:t>Уязвимость 3 — CWE-117: Log Injection через поля аудита</w:t>
+      </w:r>
+    </w:p>
+    <w:p>
+      <w:pPr>
+        <w:spacing w:after="80"/>
+        <w:ind w:left="0"/>
+      </w:pPr>
+      <w:r>
+        <w:rPr>
+          <w:b w:val="0"/>
+        </w:rPr>
+        <w:t>Модуль: internal/services/audit_service.go. Точка входа: поле details и IP-адрес во всех вызовах Log(). Sink: таблица audit_logs (SQLite). Атакующий с правами пользователя мог внедрить символы \r\n и создать в журнале фиктивные записи, искажая результаты расследования инцидентов.</w:t>
+      </w:r>
+    </w:p>
+    <w:p>
+      <w:pPr>
+        <w:spacing w:before="120" w:after="40"/>
+      </w:pPr>
+      <w:r>
+        <w:rPr>
+          <w:b/>
+          <w:sz w:val="22"/>
+        </w:rPr>
+        <w:t>Уязвимость 4 — CWE-20: Отсутствие allowlist-валидации recipientID в веб-форме</w:t>
+      </w:r>
+    </w:p>
+    <w:p>
+      <w:pPr>
+        <w:spacing w:after="80"/>
+        <w:ind w:left="0"/>
+      </w:pPr>
+      <w:r>
+        <w:rPr>
+          <w:b w:val="0"/>
+        </w:rPr>
+        <w:t>Модуль: internal/web/handler.go. Точка входа: POST /payments/new (поле recipient_id). Sink: таблица payments (SQL INSERT). Веб-форма проверяла только длину (8–20 символов), но не состав символов. Это создавало расхождение между API- и Web-интерфейсами — через веб можно было передать пробелы и спецсимволы, которые API отклонял бы.</w:t>
+      </w:r>
+    </w:p>
+    <w:p>
+      <w:pPr>
+        <w:spacing w:before="120" w:after="40"/>
+      </w:pPr>
+      <w:r>
+        <w:rPr>
+          <w:b/>
+          <w:sz w:val="22"/>
+        </w:rPr>
+        <w:t>Уязвимость 5 — CWE-209: Раскрытие внутренних деталей ошибок Go</w:t>
+      </w:r>
+    </w:p>
+    <w:p>
+      <w:pPr>
+        <w:spacing w:after="80"/>
+        <w:ind w:left="0"/>
+      </w:pPr>
+      <w:r>
+        <w:rPr>
+          <w:b w:val="0"/>
+        </w:rPr>
+        <w:t>Модуль: internal/web/handler.go. Точка входа: все страницы с рендерингом шаблонов. Sink: HTTP-ответ (браузер клиента). При ошибке парсинга или выполнения шаблона сервер возвращал полный текст ошибки Go, включая пути к файлам и имена переменных — информацию, полезную атакующему для разведки структуры приложения.</w:t>
+      </w:r>
+    </w:p>
+    <w:p>
+      <w:pPr>
+        <w:spacing w:before="200" w:after="60"/>
       </w:pPr>
       <w:r>
         <w:rPr>
@@ -3202,7 +3460,19 @@
           <w:color w:val="2E74B5"/>
           <w:sz w:val="24"/>
         </w:rPr>
-        <w:t>5.2. Сводная таблица CVSS v4.0</w:t>
+        <w:t>5.2. Таблица CVSS v4.0</w:t>
+      </w:r>
+    </w:p>
+    <w:p>
+      <w:pPr>
+        <w:spacing w:after="80"/>
+        <w:ind w:left="0"/>
+      </w:pPr>
+      <w:r>
+        <w:rPr>
+          <w:b w:val="0"/>
+        </w:rPr>
+        <w:t>Все векторы рассчитаны на официальном калькуляторе CVSS v4.0: https://www.first.org/cvss/calculator/4.0</w:t>
       </w:r>
     </w:p>
     <w:tbl>
@@ -3225,7 +3495,7 @@
         <w:tc>
           <w:tcPr>
             <w:tcW w:type="dxa" w:w="1211"/>
-            <w:shd w:val="clear" w:color="auto" w:fill="BDD7EE"/>
+            <w:shd w:val="clear" w:color="auto" w:fill="C9DAF8"/>
           </w:tcPr>
           <w:p>
             <w:pPr>
@@ -3242,7 +3512,7 @@
         <w:tc>
           <w:tcPr>
             <w:tcW w:type="dxa" w:w="1211"/>
-            <w:shd w:val="clear" w:color="auto" w:fill="BDD7EE"/>
+            <w:shd w:val="clear" w:color="auto" w:fill="C9DAF8"/>
           </w:tcPr>
           <w:p>
             <w:pPr>
@@ -3254,14 +3524,14 @@
               </w:rPr>
               <w:t>Уязвимость</w:t>
               <w:br/>
-              <w:t>Модуль/endpoint</w:t>
+              <w:t>Модуль/Endpoint</w:t>
             </w:r>
           </w:p>
         </w:tc>
         <w:tc>
           <w:tcPr>
             <w:tcW w:type="dxa" w:w="1211"/>
-            <w:shd w:val="clear" w:color="auto" w:fill="BDD7EE"/>
+            <w:shd w:val="clear" w:color="auto" w:fill="C9DAF8"/>
           </w:tcPr>
           <w:p>
             <w:pPr>
@@ -3278,7 +3548,7 @@
         <w:tc>
           <w:tcPr>
             <w:tcW w:type="dxa" w:w="1211"/>
-            <w:shd w:val="clear" w:color="auto" w:fill="BDD7EE"/>
+            <w:shd w:val="clear" w:color="auto" w:fill="C9DAF8"/>
           </w:tcPr>
           <w:p>
             <w:pPr>
@@ -3288,16 +3558,14 @@
               <w:rPr>
                 <w:b/>
               </w:rPr>
-              <w:t>CVSS v4.0</w:t>
-              <w:br/>
-              <w:t>Vector</w:t>
+              <w:t>CVSS v4.0 Vector</w:t>
             </w:r>
           </w:p>
         </w:tc>
         <w:tc>
           <w:tcPr>
             <w:tcW w:type="dxa" w:w="1211"/>
-            <w:shd w:val="clear" w:color="auto" w:fill="BDD7EE"/>
+            <w:shd w:val="clear" w:color="auto" w:fill="C9DAF8"/>
           </w:tcPr>
           <w:p>
             <w:pPr>
@@ -3314,7 +3582,7 @@
         <w:tc>
           <w:tcPr>
             <w:tcW w:type="dxa" w:w="1211"/>
-            <w:shd w:val="clear" w:color="auto" w:fill="BDD7EE"/>
+            <w:shd w:val="clear" w:color="auto" w:fill="C9DAF8"/>
           </w:tcPr>
           <w:p>
             <w:pPr>
@@ -3331,7 +3599,7 @@
         <w:tc>
           <w:tcPr>
             <w:tcW w:type="dxa" w:w="1211"/>
-            <w:shd w:val="clear" w:color="auto" w:fill="BDD7EE"/>
+            <w:shd w:val="clear" w:color="auto" w:fill="C9DAF8"/>
           </w:tcPr>
           <w:p>
             <w:pPr>
@@ -3348,7 +3616,7 @@
         <w:tc>
           <w:tcPr>
             <w:tcW w:type="dxa" w:w="1211"/>
-            <w:shd w:val="clear" w:color="auto" w:fill="BDD7EE"/>
+            <w:shd w:val="clear" w:color="auto" w:fill="C9DAF8"/>
           </w:tcPr>
           <w:p>
             <w:pPr>
@@ -3388,15 +3656,11 @@
               <w:jc w:val="left"/>
             </w:pPr>
             <w:r>
-              <w:t>Отсутствие ограничения</w:t>
-              <w:br/>
-              <w:t>размера тела запроса</w:t>
-              <w:br/>
-              <w:t>(DoS через RAM)</w:t>
+              <w:t>DoS через тело запроса</w:t>
               <w:br/>
               <w:t>cmd/server/main.go</w:t>
               <w:br/>
-              <w:t>→ все POST endpoints</w:t>
+              <w:t>все POST endpoints</w:t>
             </w:r>
           </w:p>
         </w:tc>
@@ -3461,15 +3725,15 @@
               <w:jc w:val="left"/>
             </w:pPr>
             <w:r>
-              <w:t>AV:N (сеть), AC:L (нет условий),</w:t>
+              <w:t>AV:N — атака через интернет.</w:t>
               <w:br/>
-              <w:t>AT:N, PR:N (анонимно),</w:t>
+              <w:t>AC:L, AT:N — никаких условий.</w:t>
               <w:br/>
-              <w:t>UI:N, VA:H (DoS сервиса).</w:t>
+              <w:t>PR:N — анонимно, UI:N.</w:t>
               <w:br/>
-              <w:t>Целостность не нарушается,</w:t>
+              <w:t>VA:H — сервис недоступен (OOM).</w:t>
               <w:br/>
-              <w:t>только доступность.</w:t>
+              <w:t>Конфиденциальность/целостность не затронуты.</w:t>
             </w:r>
           </w:p>
         </w:tc>
@@ -3484,7 +3748,7 @@
             <w:r>
               <w:t>1 — Критический</w:t>
               <w:br/>
-              <w:t>(устранено)</w:t>
+              <w:t>(УСТРАНЕНО)</w:t>
             </w:r>
           </w:p>
         </w:tc>
@@ -3512,13 +3776,11 @@
               <w:jc w:val="left"/>
             </w:pPr>
             <w:r>
-              <w:t>JWT cookie без флага Secure</w:t>
+              <w:t>Отсутствие jti / отзыва JWT</w:t>
               <w:br/>
-              <w:t>Передача по HTTP</w:t>
+              <w:t>auth_service.go</w:t>
               <w:br/>
-              <w:t>internal/web/handler.go</w:t>
-              <w:br/>
-              <w:t>POST /login, /register</w:t>
+              <w:t>POST /api/v1/auth/login</w:t>
             </w:r>
           </w:p>
         </w:tc>
@@ -3531,7 +3793,7 @@
               <w:jc w:val="left"/>
             </w:pPr>
             <w:r>
-              <w:t>CWE-614</w:t>
+              <w:t>CWE-613</w:t>
             </w:r>
           </w:p>
         </w:tc>
@@ -3544,7 +3806,7 @@
               <w:jc w:val="left"/>
             </w:pPr>
             <w:r>
-              <w:t>CVSS:4.0/AV:A/AC:H/AT:N/PR:N/UI:P/VC:H/VI:H/VA:N/SC:N/SI:N/SA:N</w:t>
+              <w:t>CVSS:4.0/AV:N/AC:H/AT:N/PR:N/UI:N/VC:H/VI:H/VA:N/SC:N/SI:N/SA:N</w:t>
             </w:r>
           </w:p>
         </w:tc>
@@ -3557,7 +3819,7 @@
               <w:jc w:val="left"/>
             </w:pPr>
             <w:r>
-              <w:t>6.3</w:t>
+              <w:t>7.3</w:t>
             </w:r>
           </w:p>
         </w:tc>
@@ -3570,7 +3832,7 @@
               <w:jc w:val="left"/>
             </w:pPr>
             <w:r>
-              <w:t>MEDIUM</w:t>
+              <w:t>HIGH</w:t>
             </w:r>
           </w:p>
         </w:tc>
@@ -3583,17 +3845,13 @@
               <w:jc w:val="left"/>
             </w:pPr>
             <w:r>
-              <w:t>AV:A (локальная сеть / MITM),</w:t>
+              <w:t>AV:N — атакующий работает удалённо.</w:t>
               <w:br/>
-              <w:t>AC:H (нужен перехват трафика),</w:t>
+              <w:t>AC:H — нужно предварительно завладеть токеном.</w:t>
               <w:br/>
-              <w:t>UI:P (пользователь должен</w:t>
+              <w:t>VC:H/VI:H — украденный токен даёт полный доступ.</w:t>
               <w:br/>
-              <w:t>работать по HTTP),</w:t>
-              <w:br/>
-              <w:t>VC:H (кража токена → полный доступ),</w:t>
-              <w:br/>
-              <w:t>VI:H (аутентификация от его имени).</w:t>
+              <w:t>TTL 15 мин снижает реальный риск.</w:t>
             </w:r>
           </w:p>
         </w:tc>
@@ -3608,7 +3866,9 @@
             <w:r>
               <w:t>2 — Высокий</w:t>
               <w:br/>
-              <w:t>(устранено)</w:t>
+              <w:t>(jti добавлен;</w:t>
+              <w:br/>
+              <w:t>revocation — TODO)</w:t>
             </w:r>
           </w:p>
         </w:tc>
@@ -3636,15 +3896,11 @@
               <w:jc w:val="left"/>
             </w:pPr>
             <w:r>
-              <w:t>Log Injection через</w:t>
-              <w:br/>
-              <w:t>пользовательский ввод</w:t>
-              <w:br/>
-              <w:t>internal/services/</w:t>
+              <w:t>Log Injection через audit fields</w:t>
               <w:br/>
               <w:t>audit_service.go</w:t>
               <w:br/>
-              <w:t>все Log() вызовы</w:t>
+              <w:t>все вызовы Log()</w:t>
             </w:r>
           </w:p>
         </w:tc>
@@ -3709,17 +3965,13 @@
               <w:jc w:val="left"/>
             </w:pPr>
             <w:r>
-              <w:t>AV:N, AC:L, PR:L (нужна</w:t>
+              <w:t>AV:N, AC:L — легко воспроизводимо.</w:t>
               <w:br/>
-              <w:t>аутентификация), UI:N.</w:t>
+              <w:t>PR:L — нужна авторизация пользователя.</w:t>
               <w:br/>
-              <w:t>VI:L — злоумышленник вносит</w:t>
+              <w:t>VI:L — искажение audit trail,</w:t>
               <w:br/>
-              <w:t>поддельные строки в аудит,</w:t>
-              <w:br/>
-              <w:t>что затрудняет расследование</w:t>
-              <w:br/>
-              <w:t>инцидентов. Данные не утекают.</w:t>
+              <w:t>но данные пользователей не утекают.</w:t>
             </w:r>
           </w:p>
         </w:tc>
@@ -3734,7 +3986,7 @@
             <w:r>
               <w:t>3 — Средний</w:t>
               <w:br/>
-              <w:t>(устранено)</w:t>
+              <w:t>(УСТРАНЕНО)</w:t>
             </w:r>
           </w:p>
         </w:tc>
@@ -3762,143 +4014,9 @@
               <w:jc w:val="left"/>
             </w:pPr>
             <w:r>
-              <w:t>Отсутствие jti / отзыва</w:t>
+              <w:t>Слабая валидация recipientID</w:t>
               <w:br/>
-              <w:t>JWT токенов</w:t>
-              <w:br/>
-              <w:t>internal/services/</w:t>
-              <w:br/>
-              <w:t>auth_service.go</w:t>
-              <w:br/>
-              <w:t>POST /login</w:t>
-            </w:r>
-          </w:p>
-        </w:tc>
-        <w:tc>
-          <w:tcPr>
-            <w:tcW w:type="dxa" w:w="1211"/>
-          </w:tcPr>
-          <w:p>
-            <w:pPr>
-              <w:jc w:val="left"/>
-            </w:pPr>
-            <w:r>
-              <w:t>CWE-613</w:t>
-            </w:r>
-          </w:p>
-        </w:tc>
-        <w:tc>
-          <w:tcPr>
-            <w:tcW w:type="dxa" w:w="1211"/>
-          </w:tcPr>
-          <w:p>
-            <w:pPr>
-              <w:jc w:val="left"/>
-            </w:pPr>
-            <w:r>
-              <w:t>CVSS:4.0/AV:N/AC:H/AT:N/PR:N/UI:N/VC:H/VI:H/VA:N/SC:N/SI:N/SA:N</w:t>
-            </w:r>
-          </w:p>
-        </w:tc>
-        <w:tc>
-          <w:tcPr>
-            <w:tcW w:type="dxa" w:w="1211"/>
-          </w:tcPr>
-          <w:p>
-            <w:pPr>
-              <w:jc w:val="left"/>
-            </w:pPr>
-            <w:r>
-              <w:t>7.3</w:t>
-            </w:r>
-          </w:p>
-        </w:tc>
-        <w:tc>
-          <w:tcPr>
-            <w:tcW w:type="dxa" w:w="1211"/>
-          </w:tcPr>
-          <w:p>
-            <w:pPr>
-              <w:jc w:val="left"/>
-            </w:pPr>
-            <w:r>
-              <w:t>HIGH</w:t>
-            </w:r>
-          </w:p>
-        </w:tc>
-        <w:tc>
-          <w:tcPr>
-            <w:tcW w:type="dxa" w:w="1211"/>
-          </w:tcPr>
-          <w:p>
-            <w:pPr>
-              <w:jc w:val="left"/>
-            </w:pPr>
-            <w:r>
-              <w:t>AV:N, AC:H (нужно завладеть</w:t>
-              <w:br/>
-              <w:t>токеном через утечку),</w:t>
-              <w:br/>
-              <w:t>VC:H/VI:H — украденный токен</w:t>
-              <w:br/>
-              <w:t>остаётся действительным до</w:t>
-              <w:br/>
-              <w:t>истечения, отзыв невозможен.</w:t>
-              <w:br/>
-              <w:t>Срок жизни 15 мин смягчает риск.</w:t>
-            </w:r>
-          </w:p>
-        </w:tc>
-        <w:tc>
-          <w:tcPr>
-            <w:tcW w:type="dxa" w:w="1211"/>
-          </w:tcPr>
-          <w:p>
-            <w:pPr>
-              <w:jc w:val="left"/>
-            </w:pPr>
-            <w:r>
-              <w:t>2 — Высокий</w:t>
-              <w:br/>
-              <w:t>(jti добавлен;</w:t>
-              <w:br/>
-              <w:t>revocation list —</w:t>
-              <w:br/>
-              <w:t>TODO)</w:t>
-            </w:r>
-          </w:p>
-        </w:tc>
-      </w:tr>
-      <w:tr>
-        <w:tc>
-          <w:tcPr>
-            <w:tcW w:type="dxa" w:w="1211"/>
-          </w:tcPr>
-          <w:p>
-            <w:pPr>
-              <w:jc w:val="left"/>
-            </w:pPr>
-            <w:r>
-              <w:t>5</w:t>
-            </w:r>
-          </w:p>
-        </w:tc>
-        <w:tc>
-          <w:tcPr>
-            <w:tcW w:type="dxa" w:w="1211"/>
-          </w:tcPr>
-          <w:p>
-            <w:pPr>
-              <w:jc w:val="left"/>
-            </w:pPr>
-            <w:r>
-              <w:t>Allowlist-валидация</w:t>
-              <w:br/>
-              <w:t>recipientID отсутствовала</w:t>
-              <w:br/>
-              <w:t>(только length)</w:t>
-              <w:br/>
-              <w:t>internal/web/handler.go</w:t>
+              <w:t>web/handler.go</w:t>
               <w:br/>
               <w:t>POST /payments/new</w:t>
             </w:r>
@@ -3965,19 +4083,15 @@
               <w:jc w:val="left"/>
             </w:pPr>
             <w:r>
-              <w:t>AV:N, AC:L, PR:L (авторизован),</w:t>
+              <w:t>AV:N, AC:L, PR:L.</w:t>
               <w:br/>
-              <w:t>UI:N.</w:t>
+              <w:t>VI:L — некорректные символы</w:t>
               <w:br/>
-              <w:t>VI:L — спецсимволы в поле</w:t>
+              <w:t>в поле recipient_id могут вызвать</w:t>
               <w:br/>
-              <w:t>recipientID могут вызвать</w:t>
+              <w:t>неожиданное поведение в смежных</w:t>
               <w:br/>
-              <w:t>неожиданное поведение в</w:t>
-              <w:br/>
-              <w:t>смежных системах / отчётах.</w:t>
-              <w:br/>
-              <w:t>SQL уже защищён параметрами.</w:t>
+              <w:t>системах и отчётах.</w:t>
             </w:r>
           </w:p>
         </w:tc>
@@ -3992,7 +4106,127 @@
             <w:r>
               <w:t>3 — Средний</w:t>
               <w:br/>
-              <w:t>(устранено)</w:t>
+              <w:t>(УСТРАНЕНО)</w:t>
+            </w:r>
+          </w:p>
+        </w:tc>
+      </w:tr>
+      <w:tr>
+        <w:tc>
+          <w:tcPr>
+            <w:tcW w:type="dxa" w:w="1211"/>
+          </w:tcPr>
+          <w:p>
+            <w:pPr>
+              <w:jc w:val="left"/>
+            </w:pPr>
+            <w:r>
+              <w:t>5</w:t>
+            </w:r>
+          </w:p>
+        </w:tc>
+        <w:tc>
+          <w:tcPr>
+            <w:tcW w:type="dxa" w:w="1211"/>
+          </w:tcPr>
+          <w:p>
+            <w:pPr>
+              <w:jc w:val="left"/>
+            </w:pPr>
+            <w:r>
+              <w:t>Раскрытие ошибок шаблонов</w:t>
+              <w:br/>
+              <w:t>web/handler.go</w:t>
+              <w:br/>
+              <w:t>все GET-страницы</w:t>
+            </w:r>
+          </w:p>
+        </w:tc>
+        <w:tc>
+          <w:tcPr>
+            <w:tcW w:type="dxa" w:w="1211"/>
+          </w:tcPr>
+          <w:p>
+            <w:pPr>
+              <w:jc w:val="left"/>
+            </w:pPr>
+            <w:r>
+              <w:t>CWE-209</w:t>
+            </w:r>
+          </w:p>
+        </w:tc>
+        <w:tc>
+          <w:tcPr>
+            <w:tcW w:type="dxa" w:w="1211"/>
+          </w:tcPr>
+          <w:p>
+            <w:pPr>
+              <w:jc w:val="left"/>
+            </w:pPr>
+            <w:r>
+              <w:t>CVSS:4.0/AV:N/AC:L/AT:N/PR:N/UI:N/VC:L/VI:N/VA:N/SC:N/SI:N/SA:N</w:t>
+            </w:r>
+          </w:p>
+        </w:tc>
+        <w:tc>
+          <w:tcPr>
+            <w:tcW w:type="dxa" w:w="1211"/>
+          </w:tcPr>
+          <w:p>
+            <w:pPr>
+              <w:jc w:val="left"/>
+            </w:pPr>
+            <w:r>
+              <w:t>6.9</w:t>
+            </w:r>
+          </w:p>
+        </w:tc>
+        <w:tc>
+          <w:tcPr>
+            <w:tcW w:type="dxa" w:w="1211"/>
+          </w:tcPr>
+          <w:p>
+            <w:pPr>
+              <w:jc w:val="left"/>
+            </w:pPr>
+            <w:r>
+              <w:t>MEDIUM</w:t>
+            </w:r>
+          </w:p>
+        </w:tc>
+        <w:tc>
+          <w:tcPr>
+            <w:tcW w:type="dxa" w:w="1211"/>
+          </w:tcPr>
+          <w:p>
+            <w:pPr>
+              <w:jc w:val="left"/>
+            </w:pPr>
+            <w:r>
+              <w:t>AV:N, AC:L — доступно без авторизации.</w:t>
+              <w:br/>
+              <w:t>PR:N, UI:N.</w:t>
+              <w:br/>
+              <w:t>VC:L — путь к файлу и внутренние</w:t>
+              <w:br/>
+              <w:t>имена помогают атакующему в разведке.</w:t>
+              <w:br/>
+              <w:t>Прямой утечки данных нет.</w:t>
+            </w:r>
+          </w:p>
+        </w:tc>
+        <w:tc>
+          <w:tcPr>
+            <w:tcW w:type="dxa" w:w="1211"/>
+          </w:tcPr>
+          <w:p>
+            <w:pPr>
+              <w:jc w:val="left"/>
+            </w:pPr>
+            <w:r>
+              <w:t>2 — Высокий</w:t>
+              <w:br/>
+              <w:t>(УСТРАНЕНО)</w:t>
             </w:r>
           </w:p>
         </w:tc>
@@ -4000,7 +4234,7 @@
     </w:tbl>
     <w:p>
       <w:pPr>
-        <w:spacing w:before="160" w:after="40"/>
+        <w:spacing w:before="200" w:after="60"/>
       </w:pPr>
       <w:r>
         <w:rPr>
@@ -4013,47 +4247,64 @@
     </w:p>
     <w:p>
       <w:pPr>
+        <w:spacing w:after="80"/>
         <w:ind w:left="0"/>
       </w:pPr>
       <w:r>
-        <w:t>1. CWE-400 (Score 8.7) — наивысший приоритет: анонимный DoS, не требует авторизации. Устранено.</w:t>
+        <w:rPr>
+          <w:b w:val="0"/>
+        </w:rPr>
+        <w:t>Ниже уязвимости расставлены по реальному приоритету для данного финтех-сервиса. Оценки CVSS в целом подтверждают этот порядок, хотя есть нюансы, о которых говорится в следующем разделе.</w:t>
       </w:r>
     </w:p>
     <w:p>
       <w:pPr>
-        <w:ind w:left="0"/>
+        <w:pStyle w:val="ListBullet"/>
+        <w:ind w:left="283"/>
       </w:pPr>
       <w:r>
-        <w:t>2. CWE-613 (Score 7.3) — высокий приоритет: украденный токен нельзя отозвать. jti добавлен, revocation list — roadmap.</w:t>
+        <w:t>Приоритет 1 — CWE-400 (Score 8.7): анонимный DoS, не требует авторизации, гарантированно нарушает доступность платёжного сервиса. Устранено первым.</w:t>
       </w:r>
     </w:p>
     <w:p>
       <w:pPr>
-        <w:ind w:left="0"/>
+        <w:pStyle w:val="ListBullet"/>
+        <w:ind w:left="283"/>
       </w:pPr>
       <w:r>
-        <w:t>3. CWE-614 (Score 6.3) — высокий приоритет: кража сессии через MITM. Устранено флагом Secure.</w:t>
+        <w:t>Приоритет 2 — CWE-209 (Score 6.9): хотя балл ниже CWE-613, для финтеха разведка структуры приложения — прямой вектор к более серьёзным атакам. Исправлено немедленно.</w:t>
       </w:r>
     </w:p>
     <w:p>
       <w:pPr>
-        <w:ind w:left="0"/>
+        <w:pStyle w:val="ListBullet"/>
+        <w:ind w:left="283"/>
       </w:pPr>
       <w:r>
-        <w:t>4. CWE-117 (Score 5.3) — средний приоритет: подделка аудит-журнала. Устранено sanitizeLogField().</w:t>
+        <w:t>Приоритет 2 — CWE-613 (Score 7.3): кража сессии критична, но TTL 15 минут существенно снижает реальное окно уязвимости. jti добавлен; полный revocation list — следующий шаг.</w:t>
       </w:r>
     </w:p>
     <w:p>
       <w:pPr>
-        <w:ind w:left="0"/>
+        <w:pStyle w:val="ListBullet"/>
+        <w:ind w:left="283"/>
       </w:pPr>
       <w:r>
-        <w:t>5. CWE-20 (Score 5.3) — средний приоритет: слабая валидация ввода. Устранено regex-паттерном.</w:t>
+        <w:t>Приоритет 3 — CWE-117 (Score 5.3): искажение аудит-журнала — нарушение compliance (PCI DSS, GDPR). С точки зрения бизнеса важнее, чем CVSS-балл может показывать. Устранено.</w:t>
       </w:r>
     </w:p>
     <w:p>
       <w:pPr>
-        <w:spacing w:before="160" w:after="40"/>
+        <w:pStyle w:val="ListBullet"/>
+        <w:ind w:left="283"/>
+      </w:pPr>
+      <w:r>
+        <w:t>Приоритет 3 — CWE-20 (Score 5.3): слабая валидация в веб-форме, тогда как API-валидатор уже был корректным. Устранено выравниванием паттернов.</w:t>
+      </w:r>
+    </w:p>
+    <w:p>
+      <w:pPr>
+        <w:spacing w:before="200" w:after="60"/>
       </w:pPr>
       <w:r>
         <w:rPr>
@@ -4061,15 +4312,43 @@
           <w:color w:val="2E74B5"/>
           <w:sz w:val="24"/>
         </w:rPr>
-        <w:t>5.4. Вывод: CVSS-балл vs реальный приоритет</w:t>
+        <w:t>5.4. Совпадает ли CVSS с реальным приоритетом?</w:t>
       </w:r>
     </w:p>
     <w:p>
       <w:pPr>
+        <w:spacing w:after="80"/>
         <w:ind w:left="0"/>
       </w:pPr>
       <w:r>
-        <w:t>Высокий CVSS-балл в целом совпадает с реальным приоритетом исправления для данного MVP. CWE-400 с баллом 8.7 является наиболее опасным в контексте финтех-сервиса, поскольку DoS-атака на платёжный сервис напрямую нарушает бизнес-процессы и SLA. CWE-613 (балл 7.3) формально высокий, но смягчён 15-минутным TTL токена — реальный риск ниже максимального. CWE-614 (балл 6.3) — в production-среде с обязательным HTTPS риск минимален, поэтому несмотря на «MEDIUM» балл, исправление было реализовано немедленно как architectural best practice. CWE-117 и CWE-20 имеют одинаковый балл 5.3, но CWE-117 приоритетнее с точки зрения compliance (GDPR, PCI DSS требуют целостности audit trail).</w:t>
+        <w:rPr>
+          <w:b w:val="0"/>
+        </w:rPr>
+        <w:t>В большинстве случаев — да. Наивысший CVSS-балл (8.7) у CWE-400 корректно отражает максимальный реальный риск: DoS на платёжный сервис — это немедленные финансовые потери и нарушение SLA.</w:t>
+      </w:r>
+    </w:p>
+    <w:p>
+      <w:pPr>
+        <w:spacing w:after="80"/>
+        <w:ind w:left="0"/>
+      </w:pPr>
+      <w:r>
+        <w:rPr>
+          <w:b w:val="0"/>
+        </w:rPr>
+        <w:t>Есть и отклонения. CWE-209 получил балл 6.9 («только» VC:L), однако для финтеха утечка внутренней структуры приложения открывает путь к более серьёзным атакам — реальный приоритет выше балла. Напротив, CWE-613 имеет балл 7.3 (HIGH), но TTL 15 минут значительно сокращает окно уязвимости, поэтому реальный приоритет чуть ниже формального.</w:t>
+      </w:r>
+    </w:p>
+    <w:p>
+      <w:pPr>
+        <w:spacing w:after="80"/>
+        <w:ind w:left="0"/>
+      </w:pPr>
+      <w:r>
+        <w:rPr>
+          <w:b w:val="0"/>
+        </w:rPr>
+        <w:t>Вывод: CVSS v4.0 — надёжный инструмент количественной оценки, но он не учитывает бизнес-контекст (SLA, compliance, цепочки атак). Финальный приоритет исправлений всегда должен сочетать CVSS-балл с анализом реальных угроз для конкретного бизнес-сценария.</w:t>
       </w:r>
     </w:p>
     <w:p>
@@ -4079,8 +4358,7 @@
     </w:p>
     <w:p>
       <w:pPr>
-        <w:spacing w:before="240" w:after="80"/>
-        <w:jc w:val="left"/>
+        <w:spacing w:before="280" w:after="80"/>
       </w:pPr>
       <w:r>
         <w:rPr>
@@ -4088,12 +4366,12 @@
           <w:color w:val="1F497D"/>
           <w:sz w:val="28"/>
         </w:rPr>
-        <w:t>6. Результаты SAST (gosec) и SCA (govulncheck) после исправлений</w:t>
+        <w:t>6. Результаты SAST и SCA после всех исправлений</w:t>
       </w:r>
     </w:p>
     <w:p>
       <w:pPr>
-        <w:spacing w:before="160" w:after="40"/>
+        <w:spacing w:before="200" w:after="60"/>
       </w:pPr>
       <w:r>
         <w:rPr>
@@ -4101,12 +4379,12 @@
           <w:color w:val="2E74B5"/>
           <w:sz w:val="24"/>
         </w:rPr>
-        <w:t>6.1. Gosec — после всех исправлений</w:t>
+        <w:t>6.1. Gosec (SAST)</w:t>
       </w:r>
     </w:p>
     <w:p>
       <w:pPr>
-        <w:shd w:val="clear" w:color="auto" w:fill="F2F2F2"/>
+        <w:shd w:val="clear" w:color="auto" w:fill="F0F0F0"/>
         <w:spacing w:before="40" w:after="40"/>
         <w:ind w:left="283"/>
       </w:pPr>
@@ -4118,25 +4396,34 @@
         <w:t>$ gosec ./...</w:t>
         <w:br/>
         <w:br/>
-        <w:t>Results:</w:t>
-        <w:br/>
-        <w:br/>
         <w:t>Summary:</w:t>
         <w:br/>
         <w:t xml:space="preserve">  Gosec  : dev</w:t>
         <w:br/>
         <w:t xml:space="preserve">  Files  : 21</w:t>
         <w:br/>
-        <w:t xml:space="preserve">  Lines  : 2198</w:t>
+        <w:t xml:space="preserve">  Lines  : 2219</w:t>
         <w:br/>
         <w:t xml:space="preserve">  Nosec  : 0</w:t>
         <w:br/>
-        <w:t xml:space="preserve">  Issues : 0   ← нет проблем</w:t>
+        <w:t xml:space="preserve">  Issues : 0</w:t>
       </w:r>
     </w:p>
     <w:p>
       <w:pPr>
-        <w:spacing w:before="160" w:after="40"/>
+        <w:spacing w:after="80"/>
+        <w:ind w:left="0"/>
+      </w:pPr>
+      <w:r>
+        <w:rPr>
+          <w:b w:val="0"/>
+        </w:rPr>
+        <w:t>Все ранее выявленные проблемы устранены. Gosec не выявил новых нарушений.</w:t>
+      </w:r>
+    </w:p>
+    <w:p>
+      <w:pPr>
+        <w:spacing w:before="200" w:after="60"/>
       </w:pPr>
       <w:r>
         <w:rPr>
@@ -4144,12 +4431,12 @@
           <w:color w:val="2E74B5"/>
           <w:sz w:val="24"/>
         </w:rPr>
-        <w:t>6.2. Govulncheck — анализ зависимостей</w:t>
+        <w:t>6.2. Govulncheck (SCA)</w:t>
       </w:r>
     </w:p>
     <w:p>
       <w:pPr>
-        <w:shd w:val="clear" w:color="auto" w:fill="F2F2F2"/>
+        <w:shd w:val="clear" w:color="auto" w:fill="F0F0F0"/>
         <w:spacing w:before="40" w:after="40"/>
         <w:ind w:left="283"/>
       </w:pPr>
@@ -4168,13 +4455,11 @@
         <w:t>Your code is affected by 0 vulnerabilities.</w:t>
         <w:br/>
         <w:br/>
-        <w:t>This scan also found 2 vulnerabilities in packages you import and 4</w:t>
+        <w:t>This scan found 2 vulnerabilities in packages you import and 4 in modules</w:t>
         <w:br/>
-        <w:t>vulnerabilities in modules you require, but your code doesn't appear</w:t>
+        <w:t>you require, but your code doesn't appear to call these vulnerabilities.</w:t>
         <w:br/>
-        <w:t>to call these vulnerabilities.</w:t>
-        <w:br/>
-        <w:t>(GO-2026-4440, GO-2026-4441 — golang.org/x/net/html; не вызывается в коде)</w:t>
+        <w:t>(GO-2026-4440, GO-2026-4441 — golang.org/x/net/html; HTML-парсер в коде не вызывается)</w:t>
       </w:r>
     </w:p>
     <w:p>
@@ -4184,8 +4469,7 @@
     </w:p>
     <w:p>
       <w:pPr>
-        <w:spacing w:before="240" w:after="80"/>
-        <w:jc w:val="left"/>
+        <w:spacing w:before="280" w:after="80"/>
       </w:pPr>
       <w:r>
         <w:rPr>
@@ -4198,35 +4482,104 @@
     </w:p>
     <w:p>
       <w:pPr>
+        <w:spacing w:after="80"/>
         <w:ind w:left="0"/>
       </w:pPr>
       <w:r>
-        <w:t>В ходе практической работы №5 проведён углублённый комплексный аудит безопасности MVP-системы fintech-payments-mvp по четырём направлениям.</w:t>
-      </w:r>
-    </w:p>
-    <w:p/>
-    <w:p>
-      <w:pPr>
-        <w:ind w:left="0"/>
-      </w:pPr>
-      <w:r>
-        <w:t>По итогам аудита выявлено и устранено 9 уязвимостей/недостатков, из которых 5 оценены по CVSS v4.0 (баллы 5.3–8.7). Все критические дефекты исправлены в коде; инструмент gosec подтверждает 0 проблем. Govulncheck не выявил уязвимостей в вызываемых символах.</w:t>
+        <w:rPr>
+          <w:b w:val="0"/>
+        </w:rPr>
+        <w:t>В ходе практической работы №5 был проведён углублённый комплексный аудит безопасности MVP-проекта fintech-payments-mvp по четырём направлениям. В результате выявлено и устранено 9 уязвимостей и недостатков; 5 из них оценены по CVSS v4.0 с баллами от 5.3 до 8.7.</w:t>
       </w:r>
     </w:p>
     <w:p>
       <w:pPr>
+        <w:spacing w:after="80"/>
         <w:ind w:left="0"/>
       </w:pPr>
       <w:r>
-        <w:t>Наиболее значимые улучшения: (1) защита от DoS-атак через тело запроса (MaxBodySizeMiddleware); (2) устранение log injection через sanitizeLogField; (3) корректная работа флага Secure на JWT-cookie через конфигурацию; (4) добавление jti для будущей поддержки отзыва токенов; (5) согласованная allowlist-валидация recipientID между Web- и API-интерфейсами.</w:t>
+        <w:rPr>
+          <w:b w:val="0"/>
+        </w:rPr>
+        <w:t>Наиболее значимые улучшения архитектуры безопасности:</w:t>
       </w:r>
     </w:p>
     <w:p>
       <w:pPr>
+        <w:pStyle w:val="ListBullet"/>
+        <w:ind w:left="283"/>
+      </w:pPr>
+      <w:r>
+        <w:t>MaxBodySizeMiddleware (1 МБ) — защита от DoS через исчерпание памяти (CWE-400).</w:t>
+      </w:r>
+    </w:p>
+    <w:p>
+      <w:pPr>
+        <w:pStyle w:val="ListBullet"/>
+        <w:ind w:left="283"/>
+      </w:pPr>
+      <w:r>
+        <w:t>sanitizeLogField() — предотвращение подделки аудит-журнала через CRLF-инъекцию (CWE-117).</w:t>
+      </w:r>
+    </w:p>
+    <w:p>
+      <w:pPr>
+        <w:pStyle w:val="ListBullet"/>
+        <w:ind w:left="283"/>
+      </w:pPr>
+      <w:r>
+        <w:t>Конфигурируемый флаг Secure для JWT-cookie, активированный по умолчанию (CWE-614).</w:t>
+      </w:r>
+    </w:p>
+    <w:p>
+      <w:pPr>
+        <w:pStyle w:val="ListBullet"/>
+        <w:ind w:left="283"/>
+      </w:pPr>
+      <w:r>
+        <w:t>Поле jti в JWT-токенах для поддержки будущего механизма отзыва (CWE-613).</w:t>
+      </w:r>
+    </w:p>
+    <w:p>
+      <w:pPr>
+        <w:pStyle w:val="ListBullet"/>
+        <w:ind w:left="283"/>
+      </w:pPr>
+      <w:r>
+        <w:t>Согласованная allowlist-валидация recipientID между Web- и API-интерфейсами (CWE-20).</w:t>
+      </w:r>
+    </w:p>
+    <w:p>
+      <w:pPr>
+        <w:pStyle w:val="ListBullet"/>
+        <w:ind w:left="283"/>
+      </w:pPr>
+      <w:r>
+        <w:t>Замена детализированных сообщений об ошибках шаблонов на generic «Internal server error» (CWE-209).</w:t>
+      </w:r>
+    </w:p>
+    <w:p>
+      <w:pPr>
+        <w:spacing w:after="80"/>
         <w:ind w:left="0"/>
       </w:pPr>
       <w:r>
-        <w:t>Архитектура MVP демонстрирует высокий уровень зрелости безопасности: параметризованные SQL-запросы исключают инъекции, html/template обеспечивает автоматическое экранирование XSS, ролевая модель корректно реализует object-level access control. Оставшиеся риски (revocation list, account lockout) задокументированы как roadmap-элементы для продакшн-деплоя.</w:t>
+        <w:rPr>
+          <w:b w:val="0"/>
+        </w:rPr>
+        <w:t>Gosec подтверждает 0 проблем. Govulncheck не выявил уязвимостей в вызываемых символах. Архитектура MVP демонстрирует высокий уровень зрелости: параметризованные SQL-запросы исключают инъекции, html/template защищает от XSS, ролевая модель корректно реализует object-level access control.</w:t>
+      </w:r>
+    </w:p>
+    <w:p>
+      <w:pPr>
+        <w:spacing w:after="80"/>
+        <w:ind w:left="0"/>
+      </w:pPr>
+      <w:r>
+        <w:rPr>
+          <w:b w:val="0"/>
+        </w:rPr>
+        <w:t>Оставшиеся риски — отсутствие revocation list для JWT и per-user account lockout — задокументированы как TODO-элементы roadmap для продакшн-деплоя. Оба требуют внешнего хранилища (Redis или дополнительная таблица в БД) и не реализованы в MVP ввиду его учебного характера.</w:t>
       </w:r>
     </w:p>
     <w:sectPr>

</xml_diff>